<commit_message>
feat: Make Rust first language
</commit_message>
<xml_diff>
--- a/formats/resume.docx
+++ b/formats/resume.docx
@@ -2,7 +2,7 @@
 <file path=word/document.xml><?xml version="1.0" encoding="utf-8"?>
 <w:document xmlns:w="http://schemas.openxmlformats.org/wordprocessingml/2006/main" xmlns:m="http://schemas.openxmlformats.org/officeDocument/2006/math" xmlns:r="http://schemas.openxmlformats.org/officeDocument/2006/relationships" xmlns:o="urn:schemas-microsoft-com:office:office" xmlns:v="urn:schemas-microsoft-com:vml" xmlns:w10="urn:schemas-microsoft-com:office:word" xmlns:a="http://schemas.openxmlformats.org/drawingml/2006/main" xmlns:pic="http://schemas.openxmlformats.org/drawingml/2006/picture" xmlns:wp="http://schemas.openxmlformats.org/drawingml/2006/wordprocessingDrawing">
   <w:body>
-    <w:bookmarkStart w:id="22" w:name="knowledge"/>
+    <w:bookmarkStart w:id="11" w:name="knowledge"/>
     <w:p>
       <w:pPr>
         <w:pStyle w:val="Heading1"/>
@@ -11,7 +11,7 @@
         <w:t xml:space="preserve">KNOWLEDGE</w:t>
       </w:r>
     </w:p>
-    <w:bookmarkStart w:id="21" w:name="programming"/>
+    <w:bookmarkStart w:id="10" w:name="programming"/>
     <w:p>
       <w:pPr>
         <w:pStyle w:val="Heading2"/>
@@ -22,16 +22,16 @@
     </w:p>
     <w:p>
       <w:pPr>
+        <w:pStyle w:val="Compact"/>
         <w:numPr>
           <w:ilvl w:val="0"/>
           <w:numId w:val="1001"/>
         </w:numPr>
-        <w:pStyle w:val="Compact"/>
       </w:pPr>
       <w:r>
         <w:rPr>
+          <w:i/>
           <w:iCs/>
-          <w:i/>
         </w:rPr>
         <w:t xml:space="preserve">(Experienced)</w:t>
       </w:r>
@@ -39,6 +39,12 @@
         <w:t xml:space="preserve"> </w:t>
       </w:r>
       <w:r>
+        <w:t xml:space="preserve">Rust,</w:t>
+      </w:r>
+      <w:r>
+        <w:t xml:space="preserve"> </w:t>
+      </w:r>
+      <w:r>
         <w:t xml:space="preserve">PowerShell,</w:t>
       </w:r>
       <w:r>
@@ -80,16 +86,16 @@
     </w:p>
     <w:p>
       <w:pPr>
+        <w:pStyle w:val="Compact"/>
         <w:numPr>
           <w:ilvl w:val="0"/>
           <w:numId w:val="1001"/>
         </w:numPr>
-        <w:pStyle w:val="Compact"/>
       </w:pPr>
       <w:r>
         <w:rPr>
+          <w:i/>
           <w:iCs/>
-          <w:i/>
         </w:rPr>
         <w:t xml:space="preserve">(Familiar)</w:t>
       </w:r>
@@ -97,18 +103,18 @@
         <w:t xml:space="preserve"> </w:t>
       </w:r>
       <w:r>
+        <w:t xml:space="preserve">WebAssembly,</w:t>
+      </w:r>
+      <w:r>
+        <w:t xml:space="preserve"> </w:t>
+      </w:r>
+      <w:r>
         <w:t xml:space="preserve">Julia,</w:t>
       </w:r>
       <w:r>
         <w:t xml:space="preserve"> </w:t>
       </w:r>
       <w:r>
-        <w:t xml:space="preserve">Rust,</w:t>
-      </w:r>
-      <w:r>
-        <w:t xml:space="preserve"> </w:t>
-      </w:r>
-      <w:r>
         <w:t xml:space="preserve">ReasonML,</w:t>
       </w:r>
       <w:r>
@@ -127,12 +133,6 @@
         <w:t xml:space="preserve"> </w:t>
       </w:r>
       <w:r>
-        <w:t xml:space="preserve">WebAssembly,</w:t>
-      </w:r>
-      <w:r>
-        <w:t xml:space="preserve"> </w:t>
-      </w:r>
-      <w:r>
         <w:t xml:space="preserve">Kotlin,</w:t>
       </w:r>
       <w:r>
@@ -158,7 +158,7 @@
       <w:r>
         <w:t xml:space="preserve"> </w:t>
       </w:r>
-      <w:hyperlink r:id="rId20">
+      <w:hyperlink r:id="rId9">
         <w:r>
           <w:rPr>
             <w:rStyle w:val="Hyperlink"/>
@@ -167,9 +167,9 @@
         </w:r>
       </w:hyperlink>
     </w:p>
-    <w:bookmarkEnd w:id="21"/>
-    <w:bookmarkEnd w:id="22"/>
-    <w:bookmarkStart w:id="35" w:name="skills-experience"/>
+    <w:bookmarkEnd w:id="10"/>
+    <w:bookmarkEnd w:id="11"/>
+    <w:bookmarkStart w:id="24" w:name="skills-experience"/>
     <w:p>
       <w:pPr>
         <w:pStyle w:val="Heading1"/>
@@ -178,7 +178,7 @@
         <w:t xml:space="preserve">SKILLS &amp; EXPERIENCE</w:t>
       </w:r>
     </w:p>
-    <w:bookmarkStart w:id="24" w:name="X2ebbb34eaace180d8c08291e33df9d32bbb6831"/>
+    <w:bookmarkStart w:id="13" w:name="X2ebbb34eaace180d8c08291e33df9d32bbb6831"/>
     <w:p>
       <w:pPr>
         <w:pStyle w:val="Heading2"/>
@@ -189,11 +189,11 @@
     </w:p>
     <w:p>
       <w:pPr>
+        <w:pStyle w:val="Compact"/>
         <w:numPr>
           <w:ilvl w:val="0"/>
           <w:numId w:val="1002"/>
         </w:numPr>
-        <w:pStyle w:val="Compact"/>
       </w:pPr>
       <w:r>
         <w:t xml:space="preserve">During my Master’s studies, I studied Operations Research for over a year including the basics and a Python program to leverage genetic algorithms to solve a problem with no closed form solution.</w:t>
@@ -201,11 +201,11 @@
     </w:p>
     <w:p>
       <w:pPr>
+        <w:pStyle w:val="Compact"/>
         <w:numPr>
           <w:ilvl w:val="0"/>
           <w:numId w:val="1002"/>
         </w:numPr>
-        <w:pStyle w:val="Compact"/>
       </w:pPr>
       <w:r>
         <w:t xml:space="preserve">My Master’s thesis was an original topic of my own conception and</w:t>
@@ -215,8 +215,8 @@
       </w:r>
       <w:r>
         <w:rPr>
+          <w:b/>
           <w:bCs/>
-          <w:b/>
         </w:rPr>
         <w:t xml:space="preserve">leveraged network analysis</w:t>
       </w:r>
@@ -243,11 +243,11 @@
     </w:p>
     <w:p>
       <w:pPr>
+        <w:pStyle w:val="Compact"/>
         <w:numPr>
           <w:ilvl w:val="0"/>
           <w:numId w:val="1002"/>
         </w:numPr>
-        <w:pStyle w:val="Compact"/>
       </w:pPr>
       <w:r>
         <w:t xml:space="preserve">As a developer, I have years of experience working with geospatial visualization technology. I am a</w:t>
@@ -255,7 +255,7 @@
       <w:r>
         <w:t xml:space="preserve"> </w:t>
       </w:r>
-      <w:hyperlink r:id="rId23">
+      <w:hyperlink r:id="rId12">
         <w:r>
           <w:rPr>
             <w:rStyle w:val="Hyperlink"/>
@@ -267,8 +267,8 @@
         <w:t xml:space="preserve">.</w:t>
       </w:r>
     </w:p>
-    <w:bookmarkEnd w:id="24"/>
-    <w:bookmarkStart w:id="29" w:name="Xc323c24b5658b3639a1cbecebc0cd50121ad340"/>
+    <w:bookmarkEnd w:id="13"/>
+    <w:bookmarkStart w:id="18" w:name="Xc323c24b5658b3639a1cbecebc0cd50121ad340"/>
     <w:p>
       <w:pPr>
         <w:pStyle w:val="Heading2"/>
@@ -279,11 +279,11 @@
     </w:p>
     <w:p>
       <w:pPr>
+        <w:pStyle w:val="Compact"/>
         <w:numPr>
           <w:ilvl w:val="0"/>
           <w:numId w:val="1003"/>
         </w:numPr>
-        <w:pStyle w:val="Compact"/>
       </w:pPr>
       <w:r>
         <w:t xml:space="preserve">Team lead well versed in Agile methodologies and experienced with developing and deploying software via an iterative process focused on speed and</w:t>
@@ -291,7 +291,7 @@
       <w:r>
         <w:t xml:space="preserve"> </w:t>
       </w:r>
-      <w:hyperlink r:id="rId25">
+      <w:hyperlink r:id="rId14">
         <w:r>
           <w:rPr>
             <w:rStyle w:val="Hyperlink"/>
@@ -305,11 +305,11 @@
     </w:p>
     <w:p>
       <w:pPr>
+        <w:pStyle w:val="Compact"/>
         <w:numPr>
           <w:ilvl w:val="0"/>
           <w:numId w:val="1003"/>
         </w:numPr>
-        <w:pStyle w:val="Compact"/>
       </w:pPr>
       <w:r>
         <w:t xml:space="preserve">At USSTRATCOM, designed a visual grammar in order to create detailed process documentation. The documentation is intended to help</w:t>
@@ -319,8 +319,8 @@
       </w:r>
       <w:r>
         <w:rPr>
+          <w:b/>
           <w:bCs/>
-          <w:b/>
         </w:rPr>
         <w:t xml:space="preserve">architect sustainable solutions</w:t>
       </w:r>
@@ -335,8 +335,8 @@
       </w:r>
       <w:r>
         <w:rPr>
+          <w:b/>
           <w:bCs/>
-          <w:b/>
         </w:rPr>
         <w:t xml:space="preserve">data modernization</w:t>
       </w:r>
@@ -349,11 +349,11 @@
     </w:p>
     <w:p>
       <w:pPr>
+        <w:pStyle w:val="Compact"/>
         <w:numPr>
           <w:ilvl w:val="0"/>
           <w:numId w:val="1003"/>
         </w:numPr>
-        <w:pStyle w:val="Compact"/>
       </w:pPr>
       <w:r>
         <w:t xml:space="preserve">As a BAE Systems principal engineer, consulted on multiple projects across BAE Systems and mentored developers on a daily basis</w:t>
@@ -361,11 +361,11 @@
     </w:p>
     <w:p>
       <w:pPr>
+        <w:pStyle w:val="Compact"/>
         <w:numPr>
           <w:ilvl w:val="0"/>
           <w:numId w:val="1003"/>
         </w:numPr>
-        <w:pStyle w:val="Compact"/>
       </w:pPr>
       <w:r>
         <w:t xml:space="preserve">Created a</w:t>
@@ -373,7 +373,7 @@
       <w:r>
         <w:t xml:space="preserve"> </w:t>
       </w:r>
-      <w:hyperlink r:id="rId26">
+      <w:hyperlink r:id="rId15">
         <w:r>
           <w:rPr>
             <w:rStyle w:val="Hyperlink"/>
@@ -387,16 +387,16 @@
     </w:p>
     <w:p>
       <w:pPr>
+        <w:pStyle w:val="Compact"/>
         <w:numPr>
           <w:ilvl w:val="0"/>
           <w:numId w:val="1003"/>
         </w:numPr>
-        <w:pStyle w:val="Compact"/>
       </w:pPr>
       <w:r>
         <w:rPr>
+          <w:b/>
           <w:bCs/>
-          <w:b/>
         </w:rPr>
         <w:t xml:space="preserve">Maintain security baseline</w:t>
       </w:r>
@@ -409,11 +409,11 @@
     </w:p>
     <w:p>
       <w:pPr>
+        <w:pStyle w:val="Compact"/>
         <w:numPr>
           <w:ilvl w:val="0"/>
           <w:numId w:val="1003"/>
         </w:numPr>
-        <w:pStyle w:val="Compact"/>
       </w:pPr>
       <w:r>
         <w:t xml:space="preserve">I regularly leverage software and services to implement RPA solutions for myriad task types like writing code and creating data visualizations.</w:t>
@@ -429,7 +429,7 @@
       <w:r>
         <w:t xml:space="preserve"> </w:t>
       </w:r>
-      <w:hyperlink r:id="rId27">
+      <w:hyperlink r:id="rId16">
         <w:r>
           <w:rPr>
             <w:rStyle w:val="Hyperlink"/>
@@ -446,7 +446,7 @@
       <w:r>
         <w:t xml:space="preserve"> </w:t>
       </w:r>
-      <w:hyperlink r:id="rId28">
+      <w:hyperlink r:id="rId17">
         <w:r>
           <w:rPr>
             <w:rStyle w:val="Hyperlink"/>
@@ -455,8 +455,8 @@
         </w:r>
       </w:hyperlink>
     </w:p>
-    <w:bookmarkEnd w:id="29"/>
-    <w:bookmarkStart w:id="33" w:name="training-mentorship"/>
+    <w:bookmarkEnd w:id="18"/>
+    <w:bookmarkStart w:id="22" w:name="training-mentorship"/>
     <w:p>
       <w:pPr>
         <w:pStyle w:val="Heading2"/>
@@ -467,11 +467,11 @@
     </w:p>
     <w:p>
       <w:pPr>
+        <w:pStyle w:val="Compact"/>
         <w:numPr>
           <w:ilvl w:val="0"/>
           <w:numId w:val="1004"/>
         </w:numPr>
-        <w:pStyle w:val="Compact"/>
       </w:pPr>
       <w:r>
         <w:t xml:space="preserve">As a principal engineer at BAE Systems, developed and delivered</w:t>
@@ -479,7 +479,7 @@
       <w:r>
         <w:t xml:space="preserve"> </w:t>
       </w:r>
-      <w:hyperlink r:id="rId30">
+      <w:hyperlink r:id="rId19">
         <w:r>
           <w:rPr>
             <w:rStyle w:val="Hyperlink"/>
@@ -490,11 +490,11 @@
     </w:p>
     <w:p>
       <w:pPr>
+        <w:pStyle w:val="Compact"/>
         <w:numPr>
           <w:ilvl w:val="0"/>
           <w:numId w:val="1004"/>
         </w:numPr>
-        <w:pStyle w:val="Compact"/>
       </w:pPr>
       <w:r>
         <w:t xml:space="preserve">As a Command Training Team officer liaison, guided the planning and implementation of new training practices and procedures that included achieving 100% compliance with new Navy SAPR training guidance.</w:t>
@@ -502,11 +502,11 @@
     </w:p>
     <w:p>
       <w:pPr>
+        <w:pStyle w:val="Compact"/>
         <w:numPr>
           <w:ilvl w:val="0"/>
           <w:numId w:val="1004"/>
         </w:numPr>
-        <w:pStyle w:val="Compact"/>
       </w:pPr>
       <w:r>
         <w:t xml:space="preserve">Maintained 100% readiness as the branch Training Officer ensuring that personnel were always ready to meet mission objectives.</w:t>
@@ -522,7 +522,7 @@
       <w:r>
         <w:t xml:space="preserve"> </w:t>
       </w:r>
-      <w:hyperlink r:id="rId31">
+      <w:hyperlink r:id="rId20">
         <w:r>
           <w:rPr>
             <w:rStyle w:val="Hyperlink"/>
@@ -539,7 +539,7 @@
       <w:r>
         <w:t xml:space="preserve"> </w:t>
       </w:r>
-      <w:hyperlink r:id="rId32">
+      <w:hyperlink r:id="rId21">
         <w:r>
           <w:rPr>
             <w:rStyle w:val="Hyperlink"/>
@@ -551,8 +551,8 @@
         <w:t xml:space="preserve">)</w:t>
       </w:r>
     </w:p>
-    <w:bookmarkEnd w:id="33"/>
-    <w:bookmarkStart w:id="34" w:name="engineering-general-management"/>
+    <w:bookmarkEnd w:id="22"/>
+    <w:bookmarkStart w:id="23" w:name="engineering-general-management"/>
     <w:p>
       <w:pPr>
         <w:pStyle w:val="Heading2"/>
@@ -563,11 +563,11 @@
     </w:p>
     <w:p>
       <w:pPr>
+        <w:pStyle w:val="Compact"/>
         <w:numPr>
           <w:ilvl w:val="0"/>
           <w:numId w:val="1005"/>
         </w:numPr>
-        <w:pStyle w:val="Compact"/>
       </w:pPr>
       <w:r>
         <w:t xml:space="preserve">As a division officer on a submarine, supervised the daily operations of a nuclear reactor and engine room at sea and in port, maintaining electrical power to vital systems throughout the submarine.</w:t>
@@ -575,19 +575,19 @@
     </w:p>
     <w:p>
       <w:pPr>
+        <w:pStyle w:val="Compact"/>
         <w:numPr>
           <w:ilvl w:val="0"/>
           <w:numId w:val="1005"/>
         </w:numPr>
-        <w:pStyle w:val="Compact"/>
       </w:pPr>
       <w:r>
         <w:t xml:space="preserve">Led teams through complex technical procedures, during maintenance and casualty situations, maximizing efficiency while maintaining a safe environment.</w:t>
       </w:r>
     </w:p>
-    <w:bookmarkEnd w:id="34"/>
-    <w:bookmarkEnd w:id="35"/>
-    <w:bookmarkStart w:id="50" w:name="career-timeline"/>
+    <w:bookmarkEnd w:id="23"/>
+    <w:bookmarkEnd w:id="24"/>
+    <w:bookmarkStart w:id="39" w:name="career-timeline"/>
     <w:p>
       <w:pPr>
         <w:pStyle w:val="Heading1"/>
@@ -596,7 +596,7 @@
         <w:t xml:space="preserve">CAREER TIMELINE</w:t>
       </w:r>
     </w:p>
-    <w:bookmarkStart w:id="37" w:name="present-geospatial-data-scientist"/>
+    <w:bookmarkStart w:id="26" w:name="present-geospatial-data-scientist"/>
     <w:p>
       <w:pPr>
         <w:pStyle w:val="Heading2"/>
@@ -609,10 +609,10 @@
       </w:r>
       <w:r>
         <w:rPr>
+          <w:b/>
+          <w:bCs/>
+          <w:i/>
           <w:iCs/>
-          <w:i/>
-          <w:bCs/>
-          <w:b/>
         </w:rPr>
         <w:t xml:space="preserve">Geospatial Data Scientist</w:t>
       </w:r>
@@ -621,12 +621,12 @@
       <w:pPr>
         <w:pStyle w:val="FirstParagraph"/>
       </w:pPr>
-      <w:hyperlink r:id="rId36">
+      <w:hyperlink r:id="rId25">
         <w:r>
           <w:rPr>
             <w:rStyle w:val="Hyperlink"/>
+            <w:i/>
             <w:iCs/>
-            <w:i/>
           </w:rPr>
           <w:t xml:space="preserve">@ORNL</w:t>
         </w:r>
@@ -634,11 +634,11 @@
     </w:p>
     <w:p>
       <w:pPr>
+        <w:pStyle w:val="Compact"/>
         <w:numPr>
           <w:ilvl w:val="0"/>
           <w:numId w:val="1006"/>
         </w:numPr>
-        <w:pStyle w:val="Compact"/>
       </w:pPr>
       <w:r>
         <w:t xml:space="preserve">Work closely with senior R&amp;D professionals, providing impactful machine learning engineering and advanced analytical contributions to the conceptualization and design of new approaches that solve pressing national security challenges.</w:t>
@@ -646,11 +646,11 @@
     </w:p>
     <w:p>
       <w:pPr>
+        <w:pStyle w:val="Compact"/>
         <w:numPr>
           <w:ilvl w:val="0"/>
           <w:numId w:val="1006"/>
         </w:numPr>
-        <w:pStyle w:val="Compact"/>
       </w:pPr>
       <w:r>
         <w:t xml:space="preserve">Provide coding support to implement new algorithms as proof of concept or prototype to test effectiveness and scalability of the proposed solutions.</w:t>
@@ -658,18 +658,18 @@
     </w:p>
     <w:p>
       <w:pPr>
+        <w:pStyle w:val="Compact"/>
         <w:numPr>
           <w:ilvl w:val="0"/>
           <w:numId w:val="1006"/>
         </w:numPr>
-        <w:pStyle w:val="Compact"/>
       </w:pPr>
       <w:r>
         <w:t xml:space="preserve">Work in a highly collaborative environment with data scientists, machine learning scientists, remote sensing scientists, engineers, physicists and geographers to deliver systems from prototyping to production level.</w:t>
       </w:r>
     </w:p>
-    <w:bookmarkEnd w:id="37"/>
-    <w:bookmarkStart w:id="40" w:name="X204475192f99ce84db03eca7c546a8dfddd91d5"/>
+    <w:bookmarkEnd w:id="26"/>
+    <w:bookmarkStart w:id="29" w:name="X204475192f99ce84db03eca7c546a8dfddd91d5"/>
     <w:p>
       <w:pPr>
         <w:pStyle w:val="Heading2"/>
@@ -682,10 +682,10 @@
       </w:r>
       <w:r>
         <w:rPr>
+          <w:b/>
+          <w:bCs/>
+          <w:i/>
           <w:iCs/>
-          <w:i/>
-          <w:bCs/>
-          <w:b/>
         </w:rPr>
         <w:t xml:space="preserve">Operations Research Analyst / Data Scientist</w:t>
       </w:r>
@@ -694,12 +694,12 @@
       <w:pPr>
         <w:pStyle w:val="FirstParagraph"/>
       </w:pPr>
-      <w:hyperlink r:id="rId38">
+      <w:hyperlink r:id="rId27">
         <w:r>
           <w:rPr>
             <w:rStyle w:val="Hyperlink"/>
+            <w:i/>
             <w:iCs/>
-            <w:i/>
           </w:rPr>
           <w:t xml:space="preserve">@US_Stratcom</w:t>
         </w:r>
@@ -707,11 +707,11 @@
     </w:p>
     <w:p>
       <w:pPr>
+        <w:pStyle w:val="Compact"/>
         <w:numPr>
           <w:ilvl w:val="0"/>
           <w:numId w:val="1007"/>
         </w:numPr>
-        <w:pStyle w:val="Compact"/>
       </w:pPr>
       <w:r>
         <w:t xml:space="preserve">Contributor to the DoD</w:t>
@@ -719,7 +719,7 @@
       <w:r>
         <w:t xml:space="preserve"> </w:t>
       </w:r>
-      <w:hyperlink r:id="rId39">
+      <w:hyperlink r:id="rId28">
         <w:r>
           <w:rPr>
             <w:rStyle w:val="Hyperlink"/>
@@ -736,11 +736,11 @@
     </w:p>
     <w:p>
       <w:pPr>
+        <w:pStyle w:val="Compact"/>
         <w:numPr>
           <w:ilvl w:val="0"/>
           <w:numId w:val="1007"/>
         </w:numPr>
-        <w:pStyle w:val="Compact"/>
       </w:pPr>
       <w:r>
         <w:t xml:space="preserve">Deputy team lead and Information System Security Manager (ISSM) for multi-million effort in support of national objectives</w:t>
@@ -748,11 +748,11 @@
     </w:p>
     <w:p>
       <w:pPr>
+        <w:pStyle w:val="Compact"/>
         <w:numPr>
           <w:ilvl w:val="0"/>
           <w:numId w:val="1007"/>
         </w:numPr>
-        <w:pStyle w:val="Compact"/>
       </w:pPr>
       <w:r>
         <w:t xml:space="preserve">Artificial Intelligence and Machine Learning (AI/ML) subject matter expert for the Advanced Warfare Solutions branch</w:t>
@@ -760,11 +760,11 @@
     </w:p>
     <w:p>
       <w:pPr>
+        <w:pStyle w:val="Compact"/>
         <w:numPr>
           <w:ilvl w:val="0"/>
           <w:numId w:val="1007"/>
         </w:numPr>
-        <w:pStyle w:val="Compact"/>
       </w:pPr>
       <w:r>
         <w:t xml:space="preserve">Data scientist tasked with developing better understanding of operations with the goal improving mission effectiveness and efficiency.</w:t>
@@ -772,11 +772,11 @@
     </w:p>
     <w:p>
       <w:pPr>
+        <w:pStyle w:val="Compact"/>
         <w:numPr>
           <w:ilvl w:val="0"/>
           <w:numId w:val="1007"/>
         </w:numPr>
-        <w:pStyle w:val="Compact"/>
       </w:pPr>
       <w:r>
         <w:t xml:space="preserve">Advised leadership on emergent technologies (such as AI/ML) and methodologies.</w:t>
@@ -784,18 +784,18 @@
     </w:p>
     <w:p>
       <w:pPr>
+        <w:pStyle w:val="Compact"/>
         <w:numPr>
           <w:ilvl w:val="0"/>
           <w:numId w:val="1007"/>
         </w:numPr>
-        <w:pStyle w:val="Compact"/>
       </w:pPr>
       <w:r>
         <w:t xml:space="preserve">Utilized scientific inquiry in the independent development of mathematical models and computer programs to evaluate and predict the ability to support assigned projects, studies, or problems.</w:t>
       </w:r>
     </w:p>
-    <w:bookmarkEnd w:id="40"/>
-    <w:bookmarkStart w:id="42" w:name="principal-software-engineer"/>
+    <w:bookmarkEnd w:id="29"/>
+    <w:bookmarkStart w:id="31" w:name="principal-software-engineer"/>
     <w:p>
       <w:pPr>
         <w:pStyle w:val="Heading2"/>
@@ -808,10 +808,10 @@
       </w:r>
       <w:r>
         <w:rPr>
+          <w:b/>
+          <w:bCs/>
+          <w:i/>
           <w:iCs/>
-          <w:i/>
-          <w:bCs/>
-          <w:b/>
         </w:rPr>
         <w:t xml:space="preserve">Principal Software Engineer</w:t>
       </w:r>
@@ -820,12 +820,12 @@
       <w:pPr>
         <w:pStyle w:val="FirstParagraph"/>
       </w:pPr>
-      <w:hyperlink r:id="rId41">
+      <w:hyperlink r:id="rId30">
         <w:r>
           <w:rPr>
             <w:rStyle w:val="Hyperlink"/>
+            <w:i/>
             <w:iCs/>
-            <w:i/>
           </w:rPr>
           <w:t xml:space="preserve">@BAESystemsInc</w:t>
         </w:r>
@@ -833,11 +833,11 @@
     </w:p>
     <w:p>
       <w:pPr>
+        <w:pStyle w:val="Compact"/>
         <w:numPr>
           <w:ilvl w:val="0"/>
           <w:numId w:val="1008"/>
         </w:numPr>
-        <w:pStyle w:val="Compact"/>
       </w:pPr>
       <w:r>
         <w:t xml:space="preserve">Lead developer focused on quality and sustainability with experience configuring and using various continuous integration technologies</w:t>
@@ -845,11 +845,11 @@
     </w:p>
     <w:p>
       <w:pPr>
+        <w:pStyle w:val="Compact"/>
         <w:numPr>
           <w:ilvl w:val="0"/>
           <w:numId w:val="1008"/>
         </w:numPr>
-        <w:pStyle w:val="Compact"/>
       </w:pPr>
       <w:r>
         <w:t xml:space="preserve">Developed and implemented front-end architecture and workflow for multi-million dollar application</w:t>
@@ -857,11 +857,11 @@
     </w:p>
     <w:p>
       <w:pPr>
+        <w:pStyle w:val="Compact"/>
         <w:numPr>
           <w:ilvl w:val="0"/>
           <w:numId w:val="1008"/>
         </w:numPr>
-        <w:pStyle w:val="Compact"/>
       </w:pPr>
       <w:r>
         <w:t xml:space="preserve">Served as web technology expert, experienced mentor, and valuable trainer</w:t>
@@ -869,18 +869,18 @@
     </w:p>
     <w:p>
       <w:pPr>
+        <w:pStyle w:val="Compact"/>
         <w:numPr>
           <w:ilvl w:val="0"/>
           <w:numId w:val="1008"/>
         </w:numPr>
-        <w:pStyle w:val="Compact"/>
       </w:pPr>
       <w:r>
         <w:t xml:space="preserve">Leveraged Agile practices such as scrums, sprints, extreme programming, and retrospectives.</w:t>
       </w:r>
     </w:p>
-    <w:bookmarkEnd w:id="42"/>
-    <w:bookmarkStart w:id="44" w:name="exercise-planner-readiness-coordinator"/>
+    <w:bookmarkEnd w:id="31"/>
+    <w:bookmarkStart w:id="33" w:name="exercise-planner-readiness-coordinator"/>
     <w:p>
       <w:pPr>
         <w:pStyle w:val="Heading2"/>
@@ -893,10 +893,10 @@
       </w:r>
       <w:r>
         <w:rPr>
+          <w:b/>
+          <w:bCs/>
+          <w:i/>
           <w:iCs/>
-          <w:i/>
-          <w:bCs/>
-          <w:b/>
         </w:rPr>
         <w:t xml:space="preserve">Exercise Planner &amp; Readiness Coordinator</w:t>
       </w:r>
@@ -905,12 +905,12 @@
       <w:pPr>
         <w:pStyle w:val="FirstParagraph"/>
       </w:pPr>
-      <w:hyperlink r:id="rId43">
+      <w:hyperlink r:id="rId32">
         <w:r>
           <w:rPr>
             <w:rStyle w:val="Hyperlink"/>
+            <w:i/>
             <w:iCs/>
-            <w:i/>
           </w:rPr>
           <w:t xml:space="preserve">@CJTFHOA</w:t>
         </w:r>
@@ -918,11 +918,11 @@
     </w:p>
     <w:p>
       <w:pPr>
+        <w:pStyle w:val="Compact"/>
         <w:numPr>
           <w:ilvl w:val="0"/>
           <w:numId w:val="1009"/>
         </w:numPr>
-        <w:pStyle w:val="Compact"/>
       </w:pPr>
       <w:r>
         <w:t xml:space="preserve">Conduct planning and lead cross-functional teams to execute large scale exercises</w:t>
@@ -930,11 +930,11 @@
     </w:p>
     <w:p>
       <w:pPr>
+        <w:pStyle w:val="Compact"/>
         <w:numPr>
           <w:ilvl w:val="0"/>
           <w:numId w:val="1009"/>
         </w:numPr>
-        <w:pStyle w:val="Compact"/>
       </w:pPr>
       <w:r>
         <w:t xml:space="preserve">Coordinate command readiness and ensure assessments are timely and accurate</w:t>
@@ -942,11 +942,11 @@
     </w:p>
     <w:p>
       <w:pPr>
+        <w:pStyle w:val="Compact"/>
         <w:numPr>
           <w:ilvl w:val="0"/>
           <w:numId w:val="1009"/>
         </w:numPr>
-        <w:pStyle w:val="Compact"/>
       </w:pPr>
       <w:r>
         <w:t xml:space="preserve">Develop and deliver command wide training on a weekly basis</w:t>
@@ -954,18 +954,18 @@
     </w:p>
     <w:p>
       <w:pPr>
+        <w:pStyle w:val="Compact"/>
         <w:numPr>
           <w:ilvl w:val="0"/>
           <w:numId w:val="1009"/>
         </w:numPr>
-        <w:pStyle w:val="Compact"/>
       </w:pPr>
       <w:r>
         <w:t xml:space="preserve">Knowledge Management subject matter expert</w:t>
       </w:r>
     </w:p>
-    <w:bookmarkEnd w:id="44"/>
-    <w:bookmarkStart w:id="46" w:name="senior-software-developer"/>
+    <w:bookmarkEnd w:id="33"/>
+    <w:bookmarkStart w:id="35" w:name="senior-software-developer"/>
     <w:p>
       <w:pPr>
         <w:pStyle w:val="Heading2"/>
@@ -978,10 +978,10 @@
       </w:r>
       <w:r>
         <w:rPr>
+          <w:b/>
+          <w:bCs/>
+          <w:i/>
           <w:iCs/>
-          <w:i/>
-          <w:bCs/>
-          <w:b/>
         </w:rPr>
         <w:t xml:space="preserve">Senior Software Developer</w:t>
       </w:r>
@@ -990,12 +990,12 @@
       <w:pPr>
         <w:pStyle w:val="FirstParagraph"/>
       </w:pPr>
-      <w:hyperlink r:id="rId45">
+      <w:hyperlink r:id="rId34">
         <w:r>
           <w:rPr>
             <w:rStyle w:val="Hyperlink"/>
+            <w:i/>
             <w:iCs/>
-            <w:i/>
           </w:rPr>
           <w:t xml:space="preserve">@Leidos</w:t>
         </w:r>
@@ -1003,18 +1003,18 @@
     </w:p>
     <w:p>
       <w:pPr>
+        <w:pStyle w:val="Compact"/>
         <w:numPr>
           <w:ilvl w:val="0"/>
           <w:numId w:val="1010"/>
         </w:numPr>
-        <w:pStyle w:val="Compact"/>
       </w:pPr>
       <w:r>
         <w:t xml:space="preserve">Performed agile development using popular front-end technologies such as: Ampersand.js, Reveal.js, and Cesium.js</w:t>
       </w:r>
     </w:p>
-    <w:bookmarkEnd w:id="46"/>
-    <w:bookmarkStart w:id="47" w:name="senior-software-developer-1"/>
+    <w:bookmarkEnd w:id="35"/>
+    <w:bookmarkStart w:id="36" w:name="senior-software-developer-1"/>
     <w:p>
       <w:pPr>
         <w:pStyle w:val="Heading2"/>
@@ -1027,10 +1027,10 @@
       </w:r>
       <w:r>
         <w:rPr>
+          <w:b/>
+          <w:bCs/>
+          <w:i/>
           <w:iCs/>
-          <w:i/>
-          <w:bCs/>
-          <w:b/>
         </w:rPr>
         <w:t xml:space="preserve">Senior Software Developer</w:t>
       </w:r>
@@ -1039,12 +1039,12 @@
       <w:pPr>
         <w:pStyle w:val="FirstParagraph"/>
       </w:pPr>
-      <w:hyperlink r:id="rId41">
+      <w:hyperlink r:id="rId30">
         <w:r>
           <w:rPr>
             <w:rStyle w:val="Hyperlink"/>
+            <w:i/>
             <w:iCs/>
-            <w:i/>
           </w:rPr>
           <w:t xml:space="preserve">@BAESystemsInc</w:t>
         </w:r>
@@ -1052,11 +1052,11 @@
     </w:p>
     <w:p>
       <w:pPr>
+        <w:pStyle w:val="Compact"/>
         <w:numPr>
           <w:ilvl w:val="0"/>
           <w:numId w:val="1011"/>
         </w:numPr>
-        <w:pStyle w:val="Compact"/>
       </w:pPr>
       <w:r>
         <w:t xml:space="preserve">Senior developer for multi-million dollar modern web application.</w:t>
@@ -1064,18 +1064,18 @@
     </w:p>
     <w:p>
       <w:pPr>
+        <w:pStyle w:val="Compact"/>
         <w:numPr>
           <w:ilvl w:val="0"/>
           <w:numId w:val="1011"/>
         </w:numPr>
-        <w:pStyle w:val="Compact"/>
       </w:pPr>
       <w:r>
         <w:t xml:space="preserve">Instrumental to implementing application infrastructure using MarionetteJS, HTML5, and Less.js</w:t>
       </w:r>
     </w:p>
-    <w:bookmarkEnd w:id="47"/>
-    <w:bookmarkStart w:id="48" w:name="strategic-plans-officer-security-manager"/>
+    <w:bookmarkEnd w:id="36"/>
+    <w:bookmarkStart w:id="37" w:name="strategic-plans-officer-security-manager"/>
     <w:p>
       <w:pPr>
         <w:pStyle w:val="Heading2"/>
@@ -1088,10 +1088,10 @@
       </w:r>
       <w:r>
         <w:rPr>
+          <w:b/>
+          <w:bCs/>
+          <w:i/>
           <w:iCs/>
-          <w:i/>
-          <w:bCs/>
-          <w:b/>
         </w:rPr>
         <w:t xml:space="preserve">Strategic Plans Officer / Security Manager</w:t>
       </w:r>
@@ -1102,19 +1102,19 @@
       </w:pPr>
       <w:r>
         <w:rPr>
+          <w:i/>
           <w:iCs/>
-          <w:i/>
         </w:rPr>
         <w:t xml:space="preserve">USSTRATCOM Joint Functional Component Command, Global Strike</w:t>
       </w:r>
     </w:p>
     <w:p>
       <w:pPr>
+        <w:pStyle w:val="Compact"/>
         <w:numPr>
           <w:ilvl w:val="0"/>
           <w:numId w:val="1012"/>
         </w:numPr>
-        <w:pStyle w:val="Compact"/>
       </w:pPr>
       <w:r>
         <w:t xml:space="preserve">Streamlined communication up chain of command and facilitated executive-level, biweekly planning meetings; improved planning process and enabled collaboration and senior leader strategic decision-making.</w:t>
@@ -1122,11 +1122,11 @@
     </w:p>
     <w:p>
       <w:pPr>
+        <w:pStyle w:val="Compact"/>
         <w:numPr>
           <w:ilvl w:val="0"/>
           <w:numId w:val="1012"/>
         </w:numPr>
-        <w:pStyle w:val="Compact"/>
       </w:pPr>
       <w:r>
         <w:t xml:space="preserve">Worked with and around multiple applications on a regular basis such as Global Strike Planning Aid (GSPA, now named ACME), Joint Targeting Toolbox (JTT), Digital Imagery Exploitation Engine (DIEE), SPA, and IMEA</w:t>
@@ -1134,11 +1134,11 @@
     </w:p>
     <w:p>
       <w:pPr>
+        <w:pStyle w:val="Compact"/>
         <w:numPr>
           <w:ilvl w:val="0"/>
           <w:numId w:val="1012"/>
         </w:numPr>
-        <w:pStyle w:val="Compact"/>
       </w:pPr>
       <w:r>
         <w:t xml:space="preserve">Qualified as a Collateral Damage Estimate (CDE) analyst</w:t>
@@ -1146,11 +1146,11 @@
     </w:p>
     <w:p>
       <w:pPr>
+        <w:pStyle w:val="Compact"/>
         <w:numPr>
           <w:ilvl w:val="0"/>
           <w:numId w:val="1012"/>
         </w:numPr>
-        <w:pStyle w:val="Compact"/>
       </w:pPr>
       <w:r>
         <w:t xml:space="preserve">Consulted with multiple groups in US Strategic Command; provided technical counsel on projects involving</w:t>
@@ -1160,10 +1160,10 @@
       </w:r>
       <w:r>
         <w:rPr>
+          <w:b/>
+          <w:bCs/>
+          <w:i/>
           <w:iCs/>
-          <w:i/>
-          <w:bCs/>
-          <w:b/>
         </w:rPr>
         <w:t xml:space="preserve">network analysis</w:t>
       </w:r>
@@ -1178,10 +1178,10 @@
       </w:r>
       <w:r>
         <w:rPr>
+          <w:b/>
+          <w:bCs/>
+          <w:i/>
           <w:iCs/>
-          <w:i/>
-          <w:bCs/>
-          <w:b/>
         </w:rPr>
         <w:t xml:space="preserve">operations research</w:t>
       </w:r>
@@ -1191,18 +1191,18 @@
     </w:p>
     <w:p>
       <w:pPr>
+        <w:pStyle w:val="Compact"/>
         <w:numPr>
           <w:ilvl w:val="0"/>
           <w:numId w:val="1012"/>
         </w:numPr>
-        <w:pStyle w:val="Compact"/>
       </w:pPr>
       <w:r>
         <w:t xml:space="preserve">Modernized websites, maintained collaboration tools, created new tools for mission accomplishment, and maintained overall situational picture as division knowledge manager; improved productivity and efficiency.</w:t>
       </w:r>
     </w:p>
-    <w:bookmarkEnd w:id="48"/>
-    <w:bookmarkStart w:id="49" w:name="submarine-warfare-officer"/>
+    <w:bookmarkEnd w:id="37"/>
+    <w:bookmarkStart w:id="38" w:name="submarine-warfare-officer"/>
     <w:p>
       <w:pPr>
         <w:pStyle w:val="Heading2"/>
@@ -1215,10 +1215,10 @@
       </w:r>
       <w:r>
         <w:rPr>
+          <w:b/>
+          <w:bCs/>
+          <w:i/>
           <w:iCs/>
-          <w:i/>
-          <w:bCs/>
-          <w:b/>
         </w:rPr>
         <w:t xml:space="preserve">Submarine Warfare Officer</w:t>
       </w:r>
@@ -1229,19 +1229,19 @@
       </w:pPr>
       <w:r>
         <w:rPr>
+          <w:i/>
           <w:iCs/>
-          <w:i/>
         </w:rPr>
         <w:t xml:space="preserve">USS Louisiana (SSBN 743)</w:t>
       </w:r>
     </w:p>
     <w:p>
       <w:pPr>
+        <w:pStyle w:val="Compact"/>
         <w:numPr>
           <w:ilvl w:val="0"/>
           <w:numId w:val="1013"/>
         </w:numPr>
-        <w:pStyle w:val="Compact"/>
       </w:pPr>
       <w:r>
         <w:t xml:space="preserve">Led team to verify 100% of damage control gear prior to sub’s major Operational Reactor Safeguard Exam; ensured zero deficiencies and sub’s ability to combat any casualty, real or simulated, during patrols.</w:t>
@@ -1249,11 +1249,11 @@
     </w:p>
     <w:p>
       <w:pPr>
+        <w:pStyle w:val="Compact"/>
         <w:numPr>
           <w:ilvl w:val="0"/>
           <w:numId w:val="1013"/>
         </w:numPr>
-        <w:pStyle w:val="Compact"/>
       </w:pPr>
       <w:r>
         <w:t xml:space="preserve">Led efforts to improve tracking and control of top secret material; drafted and executed aggressive plan that successfully fixed sub’s wayward security program; led to no security-related discrepancies during inspection.</w:t>
@@ -1261,19 +1261,19 @@
     </w:p>
     <w:p>
       <w:pPr>
+        <w:pStyle w:val="Compact"/>
         <w:numPr>
           <w:ilvl w:val="0"/>
           <w:numId w:val="1013"/>
         </w:numPr>
-        <w:pStyle w:val="Compact"/>
       </w:pPr>
       <w:r>
         <w:t xml:space="preserve">Selected out of 10 officers as sub’s inaugural LAN officer; essential in writing operating instructions; maintained LAN with 100% compliance and no major discrepancies during inspections.</w:t>
       </w:r>
     </w:p>
-    <w:bookmarkEnd w:id="49"/>
-    <w:bookmarkEnd w:id="50"/>
-    <w:bookmarkStart w:id="51" w:name="professional-awards"/>
+    <w:bookmarkEnd w:id="38"/>
+    <w:bookmarkEnd w:id="39"/>
+    <w:bookmarkStart w:id="40" w:name="professional-awards"/>
     <w:p>
       <w:pPr>
         <w:pStyle w:val="Heading1"/>
@@ -1284,16 +1284,16 @@
     </w:p>
     <w:p>
       <w:pPr>
+        <w:pStyle w:val="Compact"/>
         <w:numPr>
           <w:ilvl w:val="0"/>
           <w:numId w:val="1014"/>
         </w:numPr>
-        <w:pStyle w:val="Compact"/>
       </w:pPr>
       <w:r>
         <w:rPr>
+          <w:b/>
           <w:bCs/>
-          <w:b/>
         </w:rPr>
         <w:t xml:space="preserve">2022</w:t>
       </w:r>
@@ -1306,16 +1306,16 @@
     </w:p>
     <w:p>
       <w:pPr>
+        <w:pStyle w:val="Compact"/>
         <w:numPr>
           <w:ilvl w:val="0"/>
           <w:numId w:val="1014"/>
         </w:numPr>
-        <w:pStyle w:val="Compact"/>
       </w:pPr>
       <w:r>
         <w:rPr>
+          <w:b/>
           <w:bCs/>
-          <w:b/>
         </w:rPr>
         <w:t xml:space="preserve">2017</w:t>
       </w:r>
@@ -1328,16 +1328,16 @@
     </w:p>
     <w:p>
       <w:pPr>
+        <w:pStyle w:val="Compact"/>
         <w:numPr>
           <w:ilvl w:val="0"/>
           <w:numId w:val="1014"/>
         </w:numPr>
-        <w:pStyle w:val="Compact"/>
       </w:pPr>
       <w:r>
         <w:rPr>
+          <w:b/>
           <w:bCs/>
-          <w:b/>
         </w:rPr>
         <w:t xml:space="preserve">2014</w:t>
       </w:r>
@@ -1350,16 +1350,16 @@
     </w:p>
     <w:p>
       <w:pPr>
+        <w:pStyle w:val="Compact"/>
         <w:numPr>
           <w:ilvl w:val="0"/>
           <w:numId w:val="1014"/>
         </w:numPr>
-        <w:pStyle w:val="Compact"/>
       </w:pPr>
       <w:r>
         <w:rPr>
+          <w:b/>
           <w:bCs/>
-          <w:b/>
         </w:rPr>
         <w:t xml:space="preserve">2011</w:t>
       </w:r>
@@ -1372,16 +1372,16 @@
     </w:p>
     <w:p>
       <w:pPr>
+        <w:pStyle w:val="Compact"/>
         <w:numPr>
           <w:ilvl w:val="0"/>
           <w:numId w:val="1014"/>
         </w:numPr>
-        <w:pStyle w:val="Compact"/>
       </w:pPr>
       <w:r>
         <w:rPr>
+          <w:b/>
           <w:bCs/>
-          <w:b/>
         </w:rPr>
         <w:t xml:space="preserve">2010</w:t>
       </w:r>
@@ -1392,8 +1392,8 @@
         <w:t xml:space="preserve">Navy and Marine Corps Achievement</w:t>
       </w:r>
     </w:p>
-    <w:bookmarkEnd w:id="51"/>
-    <w:bookmarkStart w:id="53" w:name="education"/>
+    <w:bookmarkEnd w:id="40"/>
+    <w:bookmarkStart w:id="42" w:name="education"/>
     <w:p>
       <w:pPr>
         <w:pStyle w:val="Heading1"/>
@@ -1404,16 +1404,16 @@
     </w:p>
     <w:p>
       <w:pPr>
+        <w:pStyle w:val="Compact"/>
         <w:numPr>
           <w:ilvl w:val="0"/>
           <w:numId w:val="1015"/>
         </w:numPr>
-        <w:pStyle w:val="Compact"/>
       </w:pPr>
       <w:r>
         <w:rPr>
+          <w:b/>
           <w:bCs/>
-          <w:b/>
         </w:rPr>
         <w:t xml:space="preserve">2021</w:t>
       </w:r>
@@ -1426,16 +1426,16 @@
     </w:p>
     <w:p>
       <w:pPr>
+        <w:pStyle w:val="Compact"/>
         <w:numPr>
           <w:ilvl w:val="0"/>
           <w:numId w:val="1015"/>
         </w:numPr>
-        <w:pStyle w:val="Compact"/>
       </w:pPr>
       <w:r>
         <w:rPr>
+          <w:b/>
           <w:bCs/>
-          <w:b/>
         </w:rPr>
         <w:t xml:space="preserve">2021</w:t>
       </w:r>
@@ -1445,7 +1445,7 @@
       <w:r>
         <w:t xml:space="preserve">Strategic Leadership Fellow, USSTRATCOM (</w:t>
       </w:r>
-      <w:hyperlink r:id="rId52">
+      <w:hyperlink r:id="rId41">
         <w:r>
           <w:rPr>
             <w:rStyle w:val="Hyperlink"/>
@@ -1459,16 +1459,16 @@
     </w:p>
     <w:p>
       <w:pPr>
+        <w:pStyle w:val="Compact"/>
         <w:numPr>
           <w:ilvl w:val="0"/>
           <w:numId w:val="1015"/>
         </w:numPr>
-        <w:pStyle w:val="Compact"/>
       </w:pPr>
       <w:r>
         <w:rPr>
+          <w:b/>
           <w:bCs/>
-          <w:b/>
         </w:rPr>
         <w:t xml:space="preserve">2012</w:t>
       </w:r>
@@ -1481,16 +1481,16 @@
     </w:p>
     <w:p>
       <w:pPr>
+        <w:pStyle w:val="Compact"/>
         <w:numPr>
           <w:ilvl w:val="0"/>
           <w:numId w:val="1015"/>
         </w:numPr>
-        <w:pStyle w:val="Compact"/>
       </w:pPr>
       <w:r>
         <w:rPr>
+          <w:b/>
           <w:bCs/>
-          <w:b/>
         </w:rPr>
         <w:t xml:space="preserve">2006</w:t>
       </w:r>
@@ -1503,16 +1503,16 @@
     </w:p>
     <w:p>
       <w:pPr>
+        <w:pStyle w:val="Compact"/>
         <w:numPr>
           <w:ilvl w:val="0"/>
           <w:numId w:val="1015"/>
         </w:numPr>
-        <w:pStyle w:val="Compact"/>
       </w:pPr>
       <w:r>
         <w:rPr>
+          <w:b/>
           <w:bCs/>
-          <w:b/>
         </w:rPr>
         <w:t xml:space="preserve">2006</w:t>
       </w:r>
@@ -1523,8 +1523,8 @@
         <w:t xml:space="preserve">Bachelor of Arts, Physics, University of San Diego</w:t>
       </w:r>
     </w:p>
-    <w:bookmarkEnd w:id="53"/>
-    <w:bookmarkStart w:id="54" w:name="certifications"/>
+    <w:bookmarkEnd w:id="42"/>
+    <w:bookmarkStart w:id="43" w:name="certifications"/>
     <w:p>
       <w:pPr>
         <w:pStyle w:val="Heading1"/>
@@ -1535,16 +1535,16 @@
     </w:p>
     <w:p>
       <w:pPr>
+        <w:pStyle w:val="Compact"/>
         <w:numPr>
           <w:ilvl w:val="0"/>
           <w:numId w:val="1016"/>
         </w:numPr>
-        <w:pStyle w:val="Compact"/>
       </w:pPr>
       <w:r>
         <w:rPr>
+          <w:b/>
           <w:bCs/>
-          <w:b/>
         </w:rPr>
         <w:t xml:space="preserve">2015</w:t>
       </w:r>
@@ -1557,16 +1557,16 @@
     </w:p>
     <w:p>
       <w:pPr>
+        <w:pStyle w:val="Compact"/>
         <w:numPr>
           <w:ilvl w:val="0"/>
           <w:numId w:val="1016"/>
         </w:numPr>
-        <w:pStyle w:val="Compact"/>
       </w:pPr>
       <w:r>
         <w:rPr>
+          <w:b/>
           <w:bCs/>
-          <w:b/>
         </w:rPr>
         <w:t xml:space="preserve">2015</w:t>
       </w:r>
@@ -1577,8 +1577,8 @@
         <w:t xml:space="preserve">Professional in Human Resources (PHR)</w:t>
       </w:r>
     </w:p>
-    <w:bookmarkEnd w:id="54"/>
-    <w:bookmarkStart w:id="57" w:name="publications-citations"/>
+    <w:bookmarkEnd w:id="43"/>
+    <w:bookmarkStart w:id="46" w:name="publications-citations"/>
     <w:p>
       <w:pPr>
         <w:pStyle w:val="Heading1"/>
@@ -1589,13 +1589,13 @@
     </w:p>
     <w:p>
       <w:pPr>
+        <w:pStyle w:val="Compact"/>
         <w:numPr>
           <w:ilvl w:val="0"/>
           <w:numId w:val="1017"/>
         </w:numPr>
-        <w:pStyle w:val="Compact"/>
-      </w:pPr>
-      <w:hyperlink r:id="rId55">
+      </w:pPr>
+      <w:hyperlink r:id="rId44">
         <w:r>
           <w:rPr>
             <w:rStyle w:val="Hyperlink"/>
@@ -1606,13 +1606,13 @@
     </w:p>
     <w:p>
       <w:pPr>
+        <w:pStyle w:val="Compact"/>
         <w:numPr>
           <w:ilvl w:val="0"/>
           <w:numId w:val="1017"/>
         </w:numPr>
-        <w:pStyle w:val="Compact"/>
-      </w:pPr>
-      <w:hyperlink r:id="rId56">
+      </w:pPr>
+      <w:hyperlink r:id="rId45">
         <w:r>
           <w:rPr>
             <w:rStyle w:val="Hyperlink"/>
@@ -1621,8 +1621,8 @@
         </w:r>
       </w:hyperlink>
     </w:p>
-    <w:bookmarkEnd w:id="57"/>
-    <w:bookmarkStart w:id="64" w:name="presentations"/>
+    <w:bookmarkEnd w:id="46"/>
+    <w:bookmarkStart w:id="53" w:name="presentations"/>
     <w:p>
       <w:pPr>
         <w:pStyle w:val="Heading1"/>
@@ -1633,13 +1633,13 @@
     </w:p>
     <w:p>
       <w:pPr>
+        <w:pStyle w:val="Compact"/>
         <w:numPr>
           <w:ilvl w:val="0"/>
           <w:numId w:val="1018"/>
         </w:numPr>
-        <w:pStyle w:val="Compact"/>
-      </w:pPr>
-      <w:hyperlink r:id="rId58">
+      </w:pPr>
+      <w:hyperlink r:id="rId47">
         <w:r>
           <w:rPr>
             <w:rStyle w:val="Hyperlink"/>
@@ -1650,13 +1650,13 @@
     </w:p>
     <w:p>
       <w:pPr>
+        <w:pStyle w:val="Compact"/>
         <w:numPr>
           <w:ilvl w:val="0"/>
           <w:numId w:val="1018"/>
         </w:numPr>
-        <w:pStyle w:val="Compact"/>
-      </w:pPr>
-      <w:hyperlink r:id="rId25">
+      </w:pPr>
+      <w:hyperlink r:id="rId14">
         <w:r>
           <w:rPr>
             <w:rStyle w:val="Hyperlink"/>
@@ -1667,13 +1667,13 @@
     </w:p>
     <w:p>
       <w:pPr>
+        <w:pStyle w:val="Compact"/>
         <w:numPr>
           <w:ilvl w:val="0"/>
           <w:numId w:val="1018"/>
         </w:numPr>
-        <w:pStyle w:val="Compact"/>
-      </w:pPr>
-      <w:hyperlink r:id="rId59">
+      </w:pPr>
+      <w:hyperlink r:id="rId48">
         <w:r>
           <w:rPr>
             <w:rStyle w:val="Hyperlink"/>
@@ -1684,13 +1684,13 @@
     </w:p>
     <w:p>
       <w:pPr>
+        <w:pStyle w:val="Compact"/>
         <w:numPr>
           <w:ilvl w:val="0"/>
           <w:numId w:val="1018"/>
         </w:numPr>
-        <w:pStyle w:val="Compact"/>
-      </w:pPr>
-      <w:hyperlink r:id="rId60">
+      </w:pPr>
+      <w:hyperlink r:id="rId49">
         <w:r>
           <w:rPr>
             <w:rStyle w:val="Hyperlink"/>
@@ -1701,13 +1701,13 @@
     </w:p>
     <w:p>
       <w:pPr>
+        <w:pStyle w:val="Compact"/>
         <w:numPr>
           <w:ilvl w:val="0"/>
           <w:numId w:val="1018"/>
         </w:numPr>
-        <w:pStyle w:val="Compact"/>
-      </w:pPr>
-      <w:hyperlink r:id="rId61">
+      </w:pPr>
+      <w:hyperlink r:id="rId50">
         <w:r>
           <w:rPr>
             <w:rStyle w:val="Hyperlink"/>
@@ -1718,13 +1718,13 @@
     </w:p>
     <w:p>
       <w:pPr>
+        <w:pStyle w:val="Compact"/>
         <w:numPr>
           <w:ilvl w:val="0"/>
           <w:numId w:val="1018"/>
         </w:numPr>
-        <w:pStyle w:val="Compact"/>
-      </w:pPr>
-      <w:hyperlink r:id="rId62">
+      </w:pPr>
+      <w:hyperlink r:id="rId51">
         <w:r>
           <w:rPr>
             <w:rStyle w:val="Hyperlink"/>
@@ -1743,7 +1743,7 @@
       <w:r>
         <w:t xml:space="preserve"> </w:t>
       </w:r>
-      <w:hyperlink r:id="rId63">
+      <w:hyperlink r:id="rId52">
         <w:r>
           <w:rPr>
             <w:rStyle w:val="Hyperlink"/>
@@ -1752,8 +1752,8 @@
         </w:r>
       </w:hyperlink>
     </w:p>
-    <w:bookmarkEnd w:id="64"/>
-    <w:bookmarkStart w:id="66" w:name="other"/>
+    <w:bookmarkEnd w:id="53"/>
+    <w:bookmarkStart w:id="55" w:name="other"/>
     <w:p>
       <w:pPr>
         <w:pStyle w:val="Heading1"/>
@@ -1764,11 +1764,11 @@
     </w:p>
     <w:p>
       <w:pPr>
+        <w:pStyle w:val="Compact"/>
         <w:numPr>
           <w:ilvl w:val="0"/>
           <w:numId w:val="1019"/>
         </w:numPr>
-        <w:pStyle w:val="Compact"/>
       </w:pPr>
       <w:r>
         <w:t xml:space="preserve">Cleared for Top Secret information and granted access to Sensitive Compartmented Information based on a Single Scope Background Investigation.</w:t>
@@ -1776,11 +1776,11 @@
     </w:p>
     <w:p>
       <w:pPr>
+        <w:pStyle w:val="Compact"/>
         <w:numPr>
           <w:ilvl w:val="0"/>
           <w:numId w:val="1019"/>
         </w:numPr>
-        <w:pStyle w:val="Compact"/>
       </w:pPr>
       <w:r>
         <w:t xml:space="preserve">2019 — Completed OSCP Penetration with Kali course. I did not pass the 24hr OSCP exam, but I learned a lot in the process.</w:t>
@@ -1788,11 +1788,11 @@
     </w:p>
     <w:p>
       <w:pPr>
+        <w:pStyle w:val="Compact"/>
         <w:numPr>
           <w:ilvl w:val="0"/>
           <w:numId w:val="1019"/>
         </w:numPr>
-        <w:pStyle w:val="Compact"/>
       </w:pPr>
       <w:r>
         <w:t xml:space="preserve">2014 — Present Navy Selected Ready Reserve member (Commander, O-5)</w:t>
@@ -1808,7 +1808,7 @@
       <w:r>
         <w:t xml:space="preserve"> </w:t>
       </w:r>
-      <w:hyperlink r:id="rId65">
+      <w:hyperlink r:id="rId54">
         <w:r>
           <w:rPr>
             <w:rStyle w:val="Hyperlink"/>
@@ -1822,11 +1822,11 @@
     </w:p>
     <w:p>
       <w:pPr>
+        <w:pStyle w:val="Compact"/>
         <w:numPr>
           <w:ilvl w:val="0"/>
           <w:numId w:val="1020"/>
         </w:numPr>
-        <w:pStyle w:val="Compact"/>
       </w:pPr>
       <w:r>
         <w:t xml:space="preserve">2012 – 2013 Tutored online with tutor.com in Calculus and Algebra</w:t>
@@ -1834,18 +1834,22 @@
     </w:p>
     <w:p>
       <w:pPr>
+        <w:pStyle w:val="Compact"/>
         <w:numPr>
           <w:ilvl w:val="0"/>
           <w:numId w:val="1020"/>
         </w:numPr>
-        <w:pStyle w:val="Compact"/>
       </w:pPr>
       <w:r>
         <w:t xml:space="preserve">2011 – 2013 Tutored local high school students in Geometry and Trigonometry</w:t>
       </w:r>
     </w:p>
-    <w:bookmarkEnd w:id="66"/>
-    <w:sectPr/>
+    <w:bookmarkEnd w:id="55"/>
+    <w:sectPr>
+      <w:footnotePr>
+        <w:numRestart w:val="eachSect"/>
+      </w:footnotePr>
+    </w:sectPr>
   </w:body>
 </w:document>
 </file>
@@ -1876,14 +1880,14 @@
 <file path=word/numbering.xml><?xml version="1.0" encoding="utf-8"?>
 <w:numbering xmlns:w="http://schemas.openxmlformats.org/wordprocessingml/2006/main">
   <w:abstractNum w:abstractNumId="990">
-    <w:nsid w:val="A990"/>
+    <w:nsid w:val="0000A990"/>
     <w:multiLevelType w:val="multilevel"/>
     <w:lvl w:ilvl="0">
       <w:numFmt w:val="bullet"/>
       <w:lvlText w:val=" "/>
       <w:lvlJc w:val="left"/>
       <w:pPr>
-        <w:ind w:left="720" w:hanging="480"/>
+        <w:ind w:left="720" w:hanging="360"/>
       </w:pPr>
     </w:lvl>
     <w:lvl w:ilvl="1">
@@ -1891,7 +1895,7 @@
       <w:lvlText w:val=" "/>
       <w:lvlJc w:val="left"/>
       <w:pPr>
-        <w:ind w:left="1440" w:hanging="480"/>
+        <w:ind w:left="1440" w:hanging="360"/>
       </w:pPr>
     </w:lvl>
     <w:lvl w:ilvl="2">
@@ -1899,7 +1903,7 @@
       <w:lvlText w:val=" "/>
       <w:lvlJc w:val="left"/>
       <w:pPr>
-        <w:ind w:left="2160" w:hanging="480"/>
+        <w:ind w:left="2160" w:hanging="360"/>
       </w:pPr>
     </w:lvl>
     <w:lvl w:ilvl="3">
@@ -1907,7 +1911,7 @@
       <w:lvlText w:val=" "/>
       <w:lvlJc w:val="left"/>
       <w:pPr>
-        <w:ind w:left="2880" w:hanging="480"/>
+        <w:ind w:left="2880" w:hanging="360"/>
       </w:pPr>
     </w:lvl>
     <w:lvl w:ilvl="4">
@@ -1915,7 +1919,7 @@
       <w:lvlText w:val=" "/>
       <w:lvlJc w:val="left"/>
       <w:pPr>
-        <w:ind w:left="3600" w:hanging="480"/>
+        <w:ind w:left="3600" w:hanging="360"/>
       </w:pPr>
     </w:lvl>
     <w:lvl w:ilvl="5">
@@ -1923,7 +1927,7 @@
       <w:lvlText w:val=" "/>
       <w:lvlJc w:val="left"/>
       <w:pPr>
-        <w:ind w:left="4320" w:hanging="480"/>
+        <w:ind w:left="4320" w:hanging="360"/>
       </w:pPr>
     </w:lvl>
     <w:lvl w:ilvl="6">
@@ -1931,7 +1935,7 @@
       <w:lvlText w:val=" "/>
       <w:lvlJc w:val="left"/>
       <w:pPr>
-        <w:ind w:left="5040" w:hanging="480"/>
+        <w:ind w:left="5040" w:hanging="360"/>
       </w:pPr>
     </w:lvl>
     <w:lvl w:ilvl="7">
@@ -1939,7 +1943,7 @@
       <w:lvlText w:val=" "/>
       <w:lvlJc w:val="left"/>
       <w:pPr>
-        <w:ind w:left="5760" w:hanging="480"/>
+        <w:ind w:left="5760" w:hanging="360"/>
       </w:pPr>
     </w:lvl>
     <w:lvl w:ilvl="8">
@@ -1947,84 +1951,111 @@
       <w:lvlText w:val=" "/>
       <w:lvlJc w:val="left"/>
       <w:pPr>
-        <w:ind w:left="6480" w:hanging="480"/>
+        <w:ind w:left="6480" w:hanging="360"/>
       </w:pPr>
     </w:lvl>
   </w:abstractNum>
   <w:abstractNum w:abstractNumId="991">
-    <w:nsid w:val="A991"/>
+    <w:nsid w:val="0000A991"/>
     <w:multiLevelType w:val="multilevel"/>
     <w:lvl w:ilvl="0">
       <w:numFmt w:val="bullet"/>
-      <w:lvlText w:val="•"/>
+      <w:lvlText w:val=""/>
       <w:lvlJc w:val="left"/>
       <w:pPr>
-        <w:ind w:left="720" w:hanging="480"/>
-      </w:pPr>
+        <w:ind w:left="720" w:hanging="360"/>
+      </w:pPr>
+      <w:rPr>
+        <w:rFonts w:ascii="Symbol" w:hAnsi="Symbol" w:cs="Symbol" w:hint="default"/>
+      </w:rPr>
     </w:lvl>
     <w:lvl w:ilvl="1">
       <w:numFmt w:val="bullet"/>
-      <w:lvlText w:val="–"/>
+      <w:lvlText w:val="o"/>
       <w:lvlJc w:val="left"/>
       <w:pPr>
-        <w:ind w:left="1440" w:hanging="480"/>
-      </w:pPr>
+        <w:ind w:left="1440" w:hanging="360"/>
+      </w:pPr>
+      <w:rPr>
+        <w:rFonts w:ascii="Courier New" w:hAnsi="Courier New" w:cs="Courier New" w:hint="default"/>
+      </w:rPr>
     </w:lvl>
     <w:lvl w:ilvl="2">
       <w:numFmt w:val="bullet"/>
-      <w:lvlText w:val="•"/>
+      <w:lvlText w:val=""/>
       <w:lvlJc w:val="left"/>
       <w:pPr>
-        <w:ind w:left="2160" w:hanging="480"/>
-      </w:pPr>
+        <w:ind w:left="2160" w:hanging="360"/>
+      </w:pPr>
+      <w:rPr>
+        <w:rFonts w:ascii="Wingdings" w:hAnsi="Wingdings" w:cs="Wingdings" w:hint="default"/>
+      </w:rPr>
     </w:lvl>
     <w:lvl w:ilvl="3">
       <w:numFmt w:val="bullet"/>
-      <w:lvlText w:val="–"/>
+      <w:lvlText w:val=""/>
       <w:lvlJc w:val="left"/>
       <w:pPr>
-        <w:ind w:left="2880" w:hanging="480"/>
-      </w:pPr>
+        <w:ind w:left="2880" w:hanging="360"/>
+      </w:pPr>
+      <w:rPr>
+        <w:rFonts w:ascii="Symbol" w:hAnsi="Symbol" w:cs="Symbol" w:hint="default"/>
+      </w:rPr>
     </w:lvl>
     <w:lvl w:ilvl="4">
       <w:numFmt w:val="bullet"/>
-      <w:lvlText w:val="•"/>
+      <w:lvlText w:val="o"/>
       <w:lvlJc w:val="left"/>
       <w:pPr>
-        <w:ind w:left="3600" w:hanging="480"/>
-      </w:pPr>
+        <w:ind w:left="3600" w:hanging="360"/>
+      </w:pPr>
+      <w:rPr>
+        <w:rFonts w:ascii="Courier New" w:hAnsi="Courier New" w:cs="Courier New" w:hint="default"/>
+      </w:rPr>
     </w:lvl>
     <w:lvl w:ilvl="5">
       <w:numFmt w:val="bullet"/>
-      <w:lvlText w:val="–"/>
+      <w:lvlText w:val=""/>
       <w:lvlJc w:val="left"/>
       <w:pPr>
-        <w:ind w:left="4320" w:hanging="480"/>
-      </w:pPr>
+        <w:ind w:left="4320" w:hanging="360"/>
+      </w:pPr>
+      <w:rPr>
+        <w:rFonts w:ascii="Wingdings" w:hAnsi="Wingdings" w:cs="Wingdings" w:hint="default"/>
+      </w:rPr>
     </w:lvl>
     <w:lvl w:ilvl="6">
       <w:numFmt w:val="bullet"/>
-      <w:lvlText w:val="•"/>
+      <w:lvlText w:val=""/>
       <w:lvlJc w:val="left"/>
       <w:pPr>
-        <w:ind w:left="5040" w:hanging="480"/>
-      </w:pPr>
+        <w:ind w:left="5040" w:hanging="360"/>
+      </w:pPr>
+      <w:rPr>
+        <w:rFonts w:ascii="Symbol" w:hAnsi="Symbol" w:cs="Symbol" w:hint="default"/>
+      </w:rPr>
     </w:lvl>
     <w:lvl w:ilvl="7">
       <w:numFmt w:val="bullet"/>
-      <w:lvlText w:val="–"/>
+      <w:lvlText w:val="o"/>
       <w:lvlJc w:val="left"/>
       <w:pPr>
-        <w:ind w:left="5760" w:hanging="480"/>
-      </w:pPr>
+        <w:ind w:left="5760" w:hanging="360"/>
+      </w:pPr>
+      <w:rPr>
+        <w:rFonts w:ascii="Courier New" w:hAnsi="Courier New" w:cs="Courier New" w:hint="default"/>
+      </w:rPr>
     </w:lvl>
     <w:lvl w:ilvl="8">
       <w:numFmt w:val="bullet"/>
-      <w:lvlText w:val="•"/>
+      <w:lvlText w:val=""/>
       <w:lvlJc w:val="left"/>
       <w:pPr>
-        <w:ind w:left="6480" w:hanging="480"/>
-      </w:pPr>
+        <w:ind w:left="6480" w:hanging="360"/>
+      </w:pPr>
+      <w:rPr>
+        <w:rFonts w:ascii="Wingdings" w:hAnsi="Wingdings" w:cs="Wingdings" w:hint="default"/>
+      </w:rPr>
     </w:lvl>
   </w:abstractNum>
   <w:num w:numId="1000">
@@ -2098,10 +2129,10 @@
   <w:docDefaults>
     <w:rPrDefault>
       <w:rPr>
-        <w:rFonts w:asciiTheme="minorHAnsi" w:cstheme="minorBidi" w:eastAsiaTheme="minorHAnsi" w:hAnsiTheme="minorHAnsi"/>
+        <w:rFonts w:asciiTheme="minorHAnsi" w:cstheme="minorBidi" w:eastAsiaTheme="minorEastAsia" w:hAnsiTheme="minorHAnsi"/>
         <w:sz w:val="24"/>
         <w:szCs w:val="24"/>
-        <w:lang w:bidi="ar-SA" w:eastAsia="en-US" w:val="en-US"/>
+        <w:lang w:bidi="ar-SA" w:eastAsia="zh-CN" w:val="en-US"/>
       </w:rPr>
     </w:rPrDefault>
     <w:pPrDefault>
@@ -2119,10 +2150,10 @@
     <w:name w:val="Body Text"/>
     <w:basedOn w:val="Normal"/>
     <w:link w:val="BodyTextChar"/>
+    <w:qFormat/>
     <w:pPr>
       <w:spacing w:after="180" w:before="180"/>
     </w:pPr>
-    <w:qFormat/>
   </w:style>
   <w:style w:customStyle="1" w:styleId="FirstParagraph" w:type="paragraph">
     <w:name w:val="First Paragraph"/>
@@ -2142,57 +2173,111 @@
     <w:name w:val="Title"/>
     <w:basedOn w:val="Normal"/>
     <w:next w:val="BodyText"/>
+    <w:link w:val="TitleChar"/>
+    <w:uiPriority w:val="10"/>
     <w:qFormat/>
+    <w:rsid w:val="00A10FD9"/>
     <w:pPr>
-      <w:keepNext/>
-      <w:keepLines/>
-      <w:spacing w:after="240" w:before="480"/>
+      <w:spacing w:after="80" w:line="240" w:lineRule="auto"/>
+      <w:contextualSpacing/>
       <w:jc w:val="center"/>
     </w:pPr>
     <w:rPr>
       <w:rFonts w:asciiTheme="majorHAnsi" w:cstheme="majorBidi" w:eastAsiaTheme="majorEastAsia" w:hAnsiTheme="majorHAnsi"/>
-      <w:b/>
-      <w:bCs/>
-      <w:color w:themeColor="accent1" w:themeShade="B5" w:val="345A8A"/>
-      <w:sz w:val="36"/>
-      <w:szCs w:val="36"/>
+      <w:sz w:val="56"/>
+      <w:szCs w:val="56"/>
+    </w:rPr>
+  </w:style>
+  <w:style w:customStyle="1" w:styleId="TitleChar" w:type="character">
+    <w:name w:val="Title Char"/>
+    <w:basedOn w:val="DefaultParagraphFont"/>
+    <w:link w:val="Title"/>
+    <w:uiPriority w:val="10"/>
+    <w:rsid w:val="00A10FD9"/>
+    <w:rPr>
+      <w:rFonts w:asciiTheme="majorHAnsi" w:cstheme="majorBidi" w:eastAsiaTheme="majorEastAsia" w:hAnsiTheme="majorHAnsi"/>
+      <w:sz w:val="56"/>
+      <w:szCs w:val="56"/>
     </w:rPr>
   </w:style>
   <w:style w:styleId="Subtitle" w:type="paragraph">
     <w:name w:val="Subtitle"/>
+    <w:basedOn w:val="Title"/>
+    <w:next w:val="BodyText"/>
+    <w:link w:val="SubtitleChar"/>
+    <w:uiPriority w:val="11"/>
+    <w:qFormat/>
+    <w:rsid w:val="00A10FD9"/>
+    <w:pPr>
+      <w:numPr>
+        <w:ilvl w:val="1"/>
+      </w:numPr>
+    </w:pPr>
+    <w:rPr>
+      <w:rFonts w:cstheme="majorBidi" w:eastAsiaTheme="majorEastAsia"/>
+      <w:spacing w:val="15"/>
+      <w:sz w:val="28"/>
+      <w:szCs w:val="28"/>
+    </w:rPr>
+  </w:style>
+  <w:style w:customStyle="1" w:styleId="SubtitleChar" w:type="character">
+    <w:name w:val="Subtitle Char"/>
+    <w:basedOn w:val="DefaultParagraphFont"/>
+    <w:link w:val="Subtitle"/>
+    <w:uiPriority w:val="11"/>
+    <w:rsid w:val="00A10FD9"/>
+    <w:rPr>
+      <w:rFonts w:cstheme="majorBidi" w:eastAsiaTheme="majorEastAsia"/>
+      <w:color w:themeColor="text1" w:themeTint="A6" w:val="595959"/>
+      <w:spacing w:val="15"/>
+      <w:sz w:val="28"/>
+      <w:szCs w:val="28"/>
+    </w:rPr>
+  </w:style>
+  <w:style w:customStyle="1" w:styleId="Author" w:type="paragraph">
+    <w:name w:val="Author"/>
     <w:basedOn w:val="Title"/>
     <w:next w:val="BodyText"/>
     <w:qFormat/>
     <w:pPr>
       <w:keepNext/>
       <w:keepLines/>
-      <w:spacing w:after="240" w:before="240"/>
-      <w:jc w:val="center"/>
     </w:pPr>
     <w:rPr>
-      <w:sz w:val="30"/>
-      <w:szCs w:val="30"/>
-    </w:rPr>
-  </w:style>
-  <w:style w:customStyle="1" w:styleId="Author" w:type="paragraph">
-    <w:name w:val="Author"/>
+      <w:sz w:val="24"/>
+      <w:szCs w:val="24"/>
+    </w:rPr>
+  </w:style>
+  <w:style w:styleId="Date" w:type="paragraph">
+    <w:name w:val="Date"/>
+    <w:basedOn w:val="Title"/>
     <w:next w:val="BodyText"/>
     <w:qFormat/>
     <w:pPr>
       <w:keepNext/>
       <w:keepLines/>
-      <w:jc w:val="center"/>
     </w:pPr>
-  </w:style>
-  <w:style w:styleId="Date" w:type="paragraph">
-    <w:name w:val="Date"/>
-    <w:next w:val="BodyText"/>
+    <w:rPr>
+      <w:sz w:val="24"/>
+      <w:szCs w:val="24"/>
+    </w:rPr>
+  </w:style>
+  <w:style w:customStyle="1" w:styleId="AbstractTitle" w:type="paragraph">
+    <w:name w:val="Abstract Title"/>
+    <w:basedOn w:val="Normal"/>
+    <w:next w:val="Abstract"/>
     <w:qFormat/>
     <w:pPr>
       <w:keepNext/>
       <w:keepLines/>
+      <w:spacing w:after="0" w:before="300"/>
       <w:jc w:val="center"/>
     </w:pPr>
+    <w:rPr>
+      <w:b/>
+      <w:sz w:val="20"/>
+      <w:szCs w:val="20"/>
+    </w:rPr>
   </w:style>
   <w:style w:customStyle="1" w:styleId="Abstract" w:type="paragraph">
     <w:name w:val="Abstract"/>
@@ -2202,7 +2287,7 @@
     <w:pPr>
       <w:keepNext/>
       <w:keepLines/>
-      <w:spacing w:after="300" w:before="300"/>
+      <w:spacing w:after="300" w:before="100"/>
     </w:pPr>
     <w:rPr>
       <w:sz w:val="20"/>
@@ -2218,191 +2303,321 @@
     <w:rPr/>
   </w:style>
   <w:style w:styleId="Heading1" w:type="paragraph">
-    <w:name w:val="Heading 1"/>
+    <w:name w:val="heading 1"/>
     <w:basedOn w:val="Normal"/>
     <w:next w:val="BodyText"/>
+    <w:link w:val="Heading1Char"/>
     <w:uiPriority w:val="9"/>
     <w:qFormat/>
+    <w:rsid w:val="00A10FD9"/>
     <w:pPr>
       <w:keepNext/>
       <w:keepLines/>
-      <w:spacing w:after="0" w:before="480"/>
+      <w:spacing w:after="80" w:before="360"/>
       <w:outlineLvl w:val="0"/>
     </w:pPr>
     <w:rPr>
       <w:rFonts w:asciiTheme="majorHAnsi" w:cstheme="majorBidi" w:eastAsiaTheme="majorEastAsia" w:hAnsiTheme="majorHAnsi"/>
-      <w:b/>
-      <w:bCs/>
-      <w:color w:themeColor="accent1" w:val="4F81BD"/>
-      <w:sz w:val="32"/>
-      <w:szCs w:val="32"/>
+      <w:color w:themeColor="accent1" w:themeShade="BF" w:val="0F4761"/>
+      <w:sz w:val="40"/>
+      <w:szCs w:val="40"/>
     </w:rPr>
   </w:style>
   <w:style w:styleId="Heading2" w:type="paragraph">
-    <w:name w:val="Heading 2"/>
+    <w:name w:val="heading 2"/>
     <w:basedOn w:val="Normal"/>
     <w:next w:val="BodyText"/>
+    <w:link w:val="Heading2Char"/>
     <w:uiPriority w:val="9"/>
+    <w:semiHidden/>
     <w:unhideWhenUsed/>
     <w:qFormat/>
+    <w:rsid w:val="00A10FD9"/>
     <w:pPr>
       <w:keepNext/>
       <w:keepLines/>
-      <w:spacing w:after="0" w:before="200"/>
+      <w:spacing w:after="80" w:before="160"/>
       <w:outlineLvl w:val="1"/>
     </w:pPr>
     <w:rPr>
       <w:rFonts w:asciiTheme="majorHAnsi" w:cstheme="majorBidi" w:eastAsiaTheme="majorEastAsia" w:hAnsiTheme="majorHAnsi"/>
-      <w:b/>
-      <w:bCs/>
-      <w:color w:themeColor="accent1" w:val="4F81BD"/>
-      <w:sz w:val="28"/>
-      <w:szCs w:val="28"/>
+      <w:color w:themeColor="accent1" w:themeShade="BF" w:val="0F4761"/>
+      <w:sz w:val="32"/>
+      <w:szCs w:val="32"/>
     </w:rPr>
   </w:style>
   <w:style w:styleId="Heading3" w:type="paragraph">
-    <w:name w:val="Heading 3"/>
+    <w:name w:val="heading 3"/>
     <w:basedOn w:val="Normal"/>
     <w:next w:val="BodyText"/>
+    <w:link w:val="Heading3Char"/>
     <w:uiPriority w:val="9"/>
+    <w:semiHidden/>
     <w:unhideWhenUsed/>
     <w:qFormat/>
+    <w:rsid w:val="00A10FD9"/>
     <w:pPr>
       <w:keepNext/>
       <w:keepLines/>
-      <w:spacing w:after="0" w:before="200"/>
+      <w:spacing w:after="80" w:before="160"/>
       <w:outlineLvl w:val="2"/>
     </w:pPr>
     <w:rPr>
-      <w:rFonts w:asciiTheme="majorHAnsi" w:cstheme="majorBidi" w:eastAsiaTheme="majorEastAsia" w:hAnsiTheme="majorHAnsi"/>
-      <w:b/>
-      <w:bCs/>
-      <w:color w:themeColor="accent1" w:val="4F81BD"/>
-      <w:sz w:val="24"/>
-      <w:szCs w:val="24"/>
+      <w:rFonts w:cstheme="majorBidi" w:eastAsiaTheme="majorEastAsia"/>
+      <w:color w:themeColor="accent1" w:themeShade="BF" w:val="0F4761"/>
+      <w:sz w:val="28"/>
+      <w:szCs w:val="28"/>
     </w:rPr>
   </w:style>
   <w:style w:styleId="Heading4" w:type="paragraph">
-    <w:name w:val="Heading 4"/>
+    <w:name w:val="heading 4"/>
     <w:basedOn w:val="Normal"/>
     <w:next w:val="BodyText"/>
+    <w:link w:val="Heading4Char"/>
     <w:uiPriority w:val="9"/>
+    <w:semiHidden/>
     <w:unhideWhenUsed/>
     <w:qFormat/>
+    <w:rsid w:val="00A10FD9"/>
     <w:pPr>
       <w:keepNext/>
       <w:keepLines/>
-      <w:spacing w:after="0" w:before="200"/>
+      <w:spacing w:after="40" w:before="80"/>
       <w:outlineLvl w:val="3"/>
     </w:pPr>
     <w:rPr>
-      <w:rFonts w:asciiTheme="majorHAnsi" w:cstheme="majorBidi" w:eastAsiaTheme="majorEastAsia" w:hAnsiTheme="majorHAnsi"/>
+      <w:rFonts w:cstheme="majorBidi" w:eastAsiaTheme="majorEastAsia"/>
       <w:i/>
-      <w:bCs/>
-      <w:color w:themeColor="accent1" w:val="4F81BD"/>
-      <w:sz w:val="24"/>
-      <w:szCs w:val="24"/>
+      <w:iCs/>
+      <w:color w:themeColor="accent1" w:themeShade="BF" w:val="0F4761"/>
     </w:rPr>
   </w:style>
   <w:style w:styleId="Heading5" w:type="paragraph">
-    <w:name w:val="Heading 5"/>
+    <w:name w:val="heading 5"/>
     <w:basedOn w:val="Normal"/>
     <w:next w:val="BodyText"/>
+    <w:link w:val="Heading5Char"/>
     <w:uiPriority w:val="9"/>
+    <w:semiHidden/>
     <w:unhideWhenUsed/>
     <w:qFormat/>
+    <w:rsid w:val="00A10FD9"/>
     <w:pPr>
       <w:keepNext/>
       <w:keepLines/>
-      <w:spacing w:after="0" w:before="200"/>
+      <w:spacing w:after="40" w:before="80"/>
       <w:outlineLvl w:val="4"/>
     </w:pPr>
     <w:rPr>
-      <w:rFonts w:asciiTheme="majorHAnsi" w:cstheme="majorBidi" w:eastAsiaTheme="majorEastAsia" w:hAnsiTheme="majorHAnsi"/>
-      <w:iCs/>
-      <w:color w:themeColor="accent1" w:val="4F81BD"/>
-      <w:sz w:val="24"/>
-      <w:szCs w:val="24"/>
+      <w:rFonts w:cstheme="majorBidi" w:eastAsiaTheme="majorEastAsia"/>
+      <w:color w:themeColor="accent1" w:themeShade="BF" w:val="0F4761"/>
     </w:rPr>
   </w:style>
   <w:style w:styleId="Heading6" w:type="paragraph">
-    <w:name w:val="Heading 6"/>
+    <w:name w:val="heading 6"/>
     <w:basedOn w:val="Normal"/>
     <w:next w:val="BodyText"/>
+    <w:link w:val="Heading6Char"/>
     <w:uiPriority w:val="9"/>
+    <w:semiHidden/>
     <w:unhideWhenUsed/>
     <w:qFormat/>
+    <w:rsid w:val="00A10FD9"/>
     <w:pPr>
       <w:keepNext/>
       <w:keepLines/>
-      <w:spacing w:after="0" w:before="200"/>
+      <w:spacing w:after="0" w:before="40"/>
       <w:outlineLvl w:val="5"/>
     </w:pPr>
     <w:rPr>
-      <w:rFonts w:asciiTheme="majorHAnsi" w:cstheme="majorBidi" w:eastAsiaTheme="majorEastAsia" w:hAnsiTheme="majorHAnsi"/>
-      <w:color w:themeColor="accent1" w:val="4F81BD"/>
-      <w:sz w:val="24"/>
-      <w:szCs w:val="24"/>
+      <w:rFonts w:cstheme="majorBidi" w:eastAsiaTheme="majorEastAsia"/>
+      <w:i/>
+      <w:iCs/>
+      <w:color w:themeColor="text1" w:themeTint="A6" w:val="595959"/>
     </w:rPr>
   </w:style>
   <w:style w:styleId="Heading7" w:type="paragraph">
-    <w:name w:val="Heading 7"/>
+    <w:name w:val="heading 7"/>
     <w:basedOn w:val="Normal"/>
     <w:next w:val="BodyText"/>
+    <w:link w:val="Heading7Char"/>
     <w:uiPriority w:val="9"/>
+    <w:semiHidden/>
     <w:unhideWhenUsed/>
     <w:qFormat/>
+    <w:rsid w:val="00A10FD9"/>
     <w:pPr>
       <w:keepNext/>
       <w:keepLines/>
-      <w:spacing w:after="0" w:before="200"/>
+      <w:spacing w:after="0" w:before="40"/>
       <w:outlineLvl w:val="6"/>
     </w:pPr>
     <w:rPr>
-      <w:rFonts w:asciiTheme="majorHAnsi" w:cstheme="majorBidi" w:eastAsiaTheme="majorEastAsia" w:hAnsiTheme="majorHAnsi"/>
-      <w:color w:themeColor="accent1" w:val="4F81BD"/>
-      <w:sz w:val="24"/>
-      <w:szCs w:val="24"/>
+      <w:rFonts w:cstheme="majorBidi" w:eastAsiaTheme="majorEastAsia"/>
+      <w:color w:themeColor="text1" w:themeTint="A6" w:val="595959"/>
     </w:rPr>
   </w:style>
   <w:style w:styleId="Heading8" w:type="paragraph">
-    <w:name w:val="Heading 8"/>
+    <w:name w:val="heading 8"/>
     <w:basedOn w:val="Normal"/>
     <w:next w:val="BodyText"/>
+    <w:link w:val="Heading8Char"/>
     <w:uiPriority w:val="9"/>
+    <w:semiHidden/>
     <w:unhideWhenUsed/>
     <w:qFormat/>
+    <w:rsid w:val="00A10FD9"/>
     <w:pPr>
       <w:keepNext/>
       <w:keepLines/>
-      <w:spacing w:after="0" w:before="200"/>
+      <w:spacing w:after="0"/>
       <w:outlineLvl w:val="7"/>
     </w:pPr>
     <w:rPr>
-      <w:rFonts w:asciiTheme="majorHAnsi" w:cstheme="majorBidi" w:eastAsiaTheme="majorEastAsia" w:hAnsiTheme="majorHAnsi"/>
-      <w:color w:themeColor="accent1" w:val="4F81BD"/>
-      <w:sz w:val="24"/>
-      <w:szCs w:val="24"/>
+      <w:rFonts w:cstheme="majorBidi" w:eastAsiaTheme="majorEastAsia"/>
+      <w:i/>
+      <w:iCs/>
+      <w:color w:themeColor="text1" w:themeTint="D8" w:val="272727"/>
     </w:rPr>
   </w:style>
   <w:style w:styleId="Heading9" w:type="paragraph">
-    <w:name w:val="Heading 9"/>
+    <w:name w:val="heading 9"/>
     <w:basedOn w:val="Normal"/>
     <w:next w:val="BodyText"/>
+    <w:link w:val="Heading9Char"/>
     <w:uiPriority w:val="9"/>
+    <w:semiHidden/>
     <w:unhideWhenUsed/>
     <w:qFormat/>
+    <w:rsid w:val="00A10FD9"/>
     <w:pPr>
       <w:keepNext/>
       <w:keepLines/>
-      <w:spacing w:after="0" w:before="200"/>
+      <w:spacing w:after="0"/>
       <w:outlineLvl w:val="8"/>
     </w:pPr>
     <w:rPr>
+      <w:rFonts w:cstheme="majorBidi" w:eastAsiaTheme="majorEastAsia"/>
+      <w:color w:themeColor="text1" w:themeTint="D8" w:val="272727"/>
+    </w:rPr>
+  </w:style>
+  <w:style w:customStyle="1" w:styleId="Heading1Char" w:type="character">
+    <w:name w:val="Heading 1 Char"/>
+    <w:basedOn w:val="DefaultParagraphFont"/>
+    <w:link w:val="Heading1"/>
+    <w:uiPriority w:val="9"/>
+    <w:rsid w:val="00A10FD9"/>
+    <w:rPr>
       <w:rFonts w:asciiTheme="majorHAnsi" w:cstheme="majorBidi" w:eastAsiaTheme="majorEastAsia" w:hAnsiTheme="majorHAnsi"/>
-      <w:color w:themeColor="accent1" w:val="4F81BD"/>
-      <w:sz w:val="24"/>
-      <w:szCs w:val="24"/>
+      <w:color w:themeColor="accent1" w:themeShade="BF" w:val="0F4761"/>
+      <w:sz w:val="40"/>
+      <w:szCs w:val="40"/>
+    </w:rPr>
+  </w:style>
+  <w:style w:customStyle="1" w:styleId="Heading2Char" w:type="character">
+    <w:name w:val="Heading 2 Char"/>
+    <w:basedOn w:val="DefaultParagraphFont"/>
+    <w:link w:val="Heading2"/>
+    <w:uiPriority w:val="9"/>
+    <w:semiHidden/>
+    <w:rsid w:val="00A10FD9"/>
+    <w:rPr>
+      <w:rFonts w:asciiTheme="majorHAnsi" w:cstheme="majorBidi" w:eastAsiaTheme="majorEastAsia" w:hAnsiTheme="majorHAnsi"/>
+      <w:color w:themeColor="accent1" w:themeShade="BF" w:val="0F4761"/>
+      <w:sz w:val="32"/>
+      <w:szCs w:val="32"/>
+    </w:rPr>
+  </w:style>
+  <w:style w:customStyle="1" w:styleId="Heading3Char" w:type="character">
+    <w:name w:val="Heading 3 Char"/>
+    <w:basedOn w:val="DefaultParagraphFont"/>
+    <w:link w:val="Heading3"/>
+    <w:uiPriority w:val="9"/>
+    <w:semiHidden/>
+    <w:rsid w:val="00A10FD9"/>
+    <w:rPr>
+      <w:rFonts w:cstheme="majorBidi" w:eastAsiaTheme="majorEastAsia"/>
+      <w:color w:themeColor="accent1" w:themeShade="BF" w:val="0F4761"/>
+      <w:sz w:val="28"/>
+      <w:szCs w:val="28"/>
+    </w:rPr>
+  </w:style>
+  <w:style w:customStyle="1" w:styleId="Heading4Char" w:type="character">
+    <w:name w:val="Heading 4 Char"/>
+    <w:basedOn w:val="DefaultParagraphFont"/>
+    <w:link w:val="Heading4"/>
+    <w:uiPriority w:val="9"/>
+    <w:semiHidden/>
+    <w:rsid w:val="00A10FD9"/>
+    <w:rPr>
+      <w:rFonts w:cstheme="majorBidi" w:eastAsiaTheme="majorEastAsia"/>
+      <w:i/>
+      <w:iCs/>
+      <w:color w:themeColor="accent1" w:themeShade="BF" w:val="0F4761"/>
+    </w:rPr>
+  </w:style>
+  <w:style w:customStyle="1" w:styleId="Heading5Char" w:type="character">
+    <w:name w:val="Heading 5 Char"/>
+    <w:basedOn w:val="DefaultParagraphFont"/>
+    <w:link w:val="Heading5"/>
+    <w:uiPriority w:val="9"/>
+    <w:semiHidden/>
+    <w:rsid w:val="00A10FD9"/>
+    <w:rPr>
+      <w:rFonts w:cstheme="majorBidi" w:eastAsiaTheme="majorEastAsia"/>
+      <w:color w:themeColor="accent1" w:themeShade="BF" w:val="0F4761"/>
+    </w:rPr>
+  </w:style>
+  <w:style w:customStyle="1" w:styleId="Heading6Char" w:type="character">
+    <w:name w:val="Heading 6 Char"/>
+    <w:basedOn w:val="DefaultParagraphFont"/>
+    <w:link w:val="Heading6"/>
+    <w:uiPriority w:val="9"/>
+    <w:semiHidden/>
+    <w:rsid w:val="00A10FD9"/>
+    <w:rPr>
+      <w:rFonts w:cstheme="majorBidi" w:eastAsiaTheme="majorEastAsia"/>
+      <w:i/>
+      <w:iCs/>
+      <w:color w:themeColor="text1" w:themeTint="A6" w:val="595959"/>
+    </w:rPr>
+  </w:style>
+  <w:style w:customStyle="1" w:styleId="Heading7Char" w:type="character">
+    <w:name w:val="Heading 7 Char"/>
+    <w:basedOn w:val="DefaultParagraphFont"/>
+    <w:link w:val="Heading7"/>
+    <w:uiPriority w:val="9"/>
+    <w:semiHidden/>
+    <w:rsid w:val="00A10FD9"/>
+    <w:rPr>
+      <w:rFonts w:cstheme="majorBidi" w:eastAsiaTheme="majorEastAsia"/>
+      <w:color w:themeColor="text1" w:themeTint="A6" w:val="595959"/>
+    </w:rPr>
+  </w:style>
+  <w:style w:customStyle="1" w:styleId="Heading8Char" w:type="character">
+    <w:name w:val="Heading 8 Char"/>
+    <w:basedOn w:val="DefaultParagraphFont"/>
+    <w:link w:val="Heading8"/>
+    <w:uiPriority w:val="9"/>
+    <w:semiHidden/>
+    <w:rsid w:val="00A10FD9"/>
+    <w:rPr>
+      <w:rFonts w:cstheme="majorBidi" w:eastAsiaTheme="majorEastAsia"/>
+      <w:i/>
+      <w:iCs/>
+      <w:color w:themeColor="text1" w:themeTint="D8" w:val="272727"/>
+    </w:rPr>
+  </w:style>
+  <w:style w:customStyle="1" w:styleId="Heading9Char" w:type="character">
+    <w:name w:val="Heading 9 Char"/>
+    <w:basedOn w:val="DefaultParagraphFont"/>
+    <w:link w:val="Heading9"/>
+    <w:uiPriority w:val="9"/>
+    <w:semiHidden/>
+    <w:rsid w:val="00A10FD9"/>
+    <w:rPr>
+      <w:rFonts w:cstheme="majorBidi" w:eastAsiaTheme="majorEastAsia"/>
+      <w:color w:themeColor="text1" w:themeTint="D8" w:val="272727"/>
     </w:rPr>
   </w:style>
   <w:style w:styleId="BlockText" w:type="paragraph">
@@ -2424,6 +2639,18 @@
     <w:uiPriority w:val="9"/>
     <w:unhideWhenUsed/>
     <w:qFormat/>
+  </w:style>
+  <w:style w:styleId="FootnoteBlockText" w:type="paragraph">
+    <w:name w:val="Footnote Block Text"/>
+    <w:basedOn w:val="FootnoteText"/>
+    <w:next w:val="FootnoteText"/>
+    <w:uiPriority w:val="9"/>
+    <w:unhideWhenUsed/>
+    <w:qFormat/>
+    <w:pPr>
+      <w:spacing w:after="100" w:before="100"/>
+      <w:ind w:firstLine="0" w:left="480" w:right="480"/>
+    </w:pPr>
   </w:style>
   <w:style w:default="1" w:styleId="DefaultParagraphFont" w:type="character">
     <w:name w:val="Default Paragraph Font"/>
@@ -2446,18 +2673,11 @@
       </w:tblCellMar>
     </w:tblPr>
     <w:tblStylePr w:type="firstRow">
-      <w:tblPr>
-        <w:jc w:val="left"/>
-        <w:tblInd w:type="dxa" w:w="0"/>
-      </w:tblPr>
-      <w:trPr>
-        <w:jc w:val="left"/>
-      </w:trPr>
       <w:tcPr>
-        <w:vAlign w:val="bottom"/>
         <w:tcBorders>
           <w:bottom w:val="single"/>
         </w:tcBorders>
+        <w:vAlign w:val="bottom"/>
       </w:tcPr>
     </w:tblStylePr>
   </w:style>
@@ -2572,8 +2792,8 @@
     <w:name w:val="KeywordTok"/>
     <w:basedOn w:val="VerbatimChar"/>
     <w:rPr>
+      <w:b/>
       <w:color w:val="007020"/>
-      <w:b/>
     </w:rPr>
   </w:style>
   <w:style w:type="character" w:customStyle="1" w:styleId="DataTypeTok">
@@ -2649,40 +2869,43 @@
   <w:style w:type="character" w:customStyle="1" w:styleId="ImportTok">
     <w:name w:val="ImportTok"/>
     <w:basedOn w:val="VerbatimChar"/>
-    <w:rPr/>
+    <w:rPr>
+      <w:b/>
+      <w:color w:val="008000"/>
+    </w:rPr>
   </w:style>
   <w:style w:type="character" w:customStyle="1" w:styleId="CommentTok">
     <w:name w:val="CommentTok"/>
     <w:basedOn w:val="VerbatimChar"/>
     <w:rPr>
+      <w:i/>
       <w:color w:val="60a0b0"/>
-      <w:i/>
     </w:rPr>
   </w:style>
   <w:style w:type="character" w:customStyle="1" w:styleId="DocumentationTok">
     <w:name w:val="DocumentationTok"/>
     <w:basedOn w:val="VerbatimChar"/>
     <w:rPr>
+      <w:i/>
       <w:color w:val="ba2121"/>
-      <w:i/>
     </w:rPr>
   </w:style>
   <w:style w:type="character" w:customStyle="1" w:styleId="AnnotationTok">
     <w:name w:val="AnnotationTok"/>
     <w:basedOn w:val="VerbatimChar"/>
     <w:rPr>
-      <w:color w:val="60a0b0"/>
       <w:b/>
       <w:i/>
+      <w:color w:val="60a0b0"/>
     </w:rPr>
   </w:style>
   <w:style w:type="character" w:customStyle="1" w:styleId="CommentVarTok">
     <w:name w:val="CommentVarTok"/>
     <w:basedOn w:val="VerbatimChar"/>
     <w:rPr>
-      <w:color w:val="60a0b0"/>
       <w:b/>
       <w:i/>
+      <w:color w:val="60a0b0"/>
     </w:rPr>
   </w:style>
   <w:style w:type="character" w:customStyle="1" w:styleId="OtherTok">
@@ -2710,8 +2933,8 @@
     <w:name w:val="ControlFlowTok"/>
     <w:basedOn w:val="VerbatimChar"/>
     <w:rPr>
+      <w:b/>
       <w:color w:val="007020"/>
-      <w:b/>
     </w:rPr>
   </w:style>
   <w:style w:type="character" w:customStyle="1" w:styleId="OperatorTok">
@@ -2724,7 +2947,9 @@
   <w:style w:type="character" w:customStyle="1" w:styleId="BuiltInTok">
     <w:name w:val="BuiltInTok"/>
     <w:basedOn w:val="VerbatimChar"/>
-    <w:rPr/>
+    <w:rPr>
+      <w:color w:val="008000"/>
+    </w:rPr>
   </w:style>
   <w:style w:type="character" w:customStyle="1" w:styleId="ExtensionTok">
     <w:name w:val="ExtensionTok"/>
@@ -2754,34 +2979,34 @@
     <w:name w:val="InformationTok"/>
     <w:basedOn w:val="VerbatimChar"/>
     <w:rPr>
-      <w:color w:val="60a0b0"/>
       <w:b/>
       <w:i/>
+      <w:color w:val="60a0b0"/>
     </w:rPr>
   </w:style>
   <w:style w:type="character" w:customStyle="1" w:styleId="WarningTok">
     <w:name w:val="WarningTok"/>
     <w:basedOn w:val="VerbatimChar"/>
     <w:rPr>
-      <w:color w:val="60a0b0"/>
       <w:b/>
       <w:i/>
+      <w:color w:val="60a0b0"/>
     </w:rPr>
   </w:style>
   <w:style w:type="character" w:customStyle="1" w:styleId="AlertTok">
     <w:name w:val="AlertTok"/>
     <w:basedOn w:val="VerbatimChar"/>
     <w:rPr>
+      <w:b/>
       <w:color w:val="ff0000"/>
-      <w:b/>
     </w:rPr>
   </w:style>
   <w:style w:type="character" w:customStyle="1" w:styleId="ErrorTok">
     <w:name w:val="ErrorTok"/>
     <w:basedOn w:val="VerbatimChar"/>
     <w:rPr>
+      <w:b/>
       <w:color w:val="ff0000"/>
-      <w:b/>
     </w:rPr>
   </w:style>
   <w:style w:type="character" w:customStyle="1" w:styleId="NormalTok">
@@ -2803,44 +3028,44 @@
         <a:sysClr val="window" lastClr="FFFFFF"/>
       </a:lt1>
       <a:dk2>
-        <a:srgbClr val="1F497D"/>
+        <a:srgbClr val="0E2841"/>
       </a:dk2>
       <a:lt2>
-        <a:srgbClr val="EEECE1"/>
+        <a:srgbClr val="E8E8E8"/>
       </a:lt2>
       <a:accent1>
-        <a:srgbClr val="4F81BD"/>
+        <a:srgbClr val="156082"/>
       </a:accent1>
       <a:accent2>
-        <a:srgbClr val="C0504D"/>
+        <a:srgbClr val="E97132"/>
       </a:accent2>
       <a:accent3>
-        <a:srgbClr val="9BBB59"/>
+        <a:srgbClr val="196B24"/>
       </a:accent3>
       <a:accent4>
-        <a:srgbClr val="8064A2"/>
+        <a:srgbClr val="0F9ED5"/>
       </a:accent4>
       <a:accent5>
-        <a:srgbClr val="4BACC6"/>
+        <a:srgbClr val="A02B93"/>
       </a:accent5>
       <a:accent6>
-        <a:srgbClr val="F79646"/>
+        <a:srgbClr val="4EA72E"/>
       </a:accent6>
       <a:hlink>
-        <a:srgbClr val="0000FF"/>
+        <a:srgbClr val="467886"/>
       </a:hlink>
       <a:folHlink>
-        <a:srgbClr val="800080"/>
+        <a:srgbClr val="96607D"/>
       </a:folHlink>
     </a:clrScheme>
     <a:fontScheme name="Office">
       <a:majorFont>
-        <a:latin typeface="Calibri"/>
+        <a:latin typeface="Aptos Display" panose="02110004020202020204"/>
         <a:ea typeface=""/>
         <a:cs typeface=""/>
-        <a:font script="Jpan" typeface="ＭＳ ゴシック"/>
+        <a:font script="Jpan" typeface="游ゴシック Light"/>
         <a:font script="Hang" typeface="맑은 고딕"/>
-        <a:font script="Hans" typeface="宋体"/>
+        <a:font script="Hans" typeface="等线 Light"/>
         <a:font script="Hant" typeface="新細明體"/>
         <a:font script="Arab" typeface="Times New Roman"/>
         <a:font script="Hebr" typeface="Times New Roman"/>
@@ -2867,14 +3092,32 @@
         <a:font script="Mong" typeface="Mongolian Baiti"/>
         <a:font script="Viet" typeface="Times New Roman"/>
         <a:font script="Uigh" typeface="Microsoft Uighur"/>
+        <a:font script="Geor" typeface="Sylfaen"/>
+        <a:font script="Armn" typeface="Arial"/>
+        <a:font script="Bugi" typeface="Leelawadee UI"/>
+        <a:font script="Bopo" typeface="Microsoft JhengHei"/>
+        <a:font script="Java" typeface="Javanese Text"/>
+        <a:font script="Lisu" typeface="Segoe UI"/>
+        <a:font script="Mymr" typeface="Myanmar Text"/>
+        <a:font script="Nkoo" typeface="Ebrima"/>
+        <a:font script="Olck" typeface="Nirmala UI"/>
+        <a:font script="Osma" typeface="Ebrima"/>
+        <a:font script="Phag" typeface="Phagspa"/>
+        <a:font script="Syrn" typeface="Estrangelo Edessa"/>
+        <a:font script="Syrj" typeface="Estrangelo Edessa"/>
+        <a:font script="Syre" typeface="Estrangelo Edessa"/>
+        <a:font script="Sora" typeface="Nirmala UI"/>
+        <a:font script="Tale" typeface="Microsoft Tai Le"/>
+        <a:font script="Talu" typeface="Microsoft New Tai Lue"/>
+        <a:font script="Tfng" typeface="Ebrima"/>
       </a:majorFont>
       <a:minorFont>
-        <a:latin typeface="Cambria"/>
+        <a:latin typeface="Aptos" panose="02110004020202020204"/>
         <a:ea typeface=""/>
         <a:cs typeface=""/>
-        <a:font script="Jpan" typeface="ＭＳ 明朝"/>
+        <a:font script="Jpan" typeface="游明朝"/>
         <a:font script="Hang" typeface="맑은 고딕"/>
-        <a:font script="Hans" typeface="宋体"/>
+        <a:font script="Hans" typeface="等线"/>
         <a:font script="Hant" typeface="新細明體"/>
         <a:font script="Arab" typeface="Arial"/>
         <a:font script="Hebr" typeface="Arial"/>
@@ -2901,6 +3144,24 @@
         <a:font script="Mong" typeface="Mongolian Baiti"/>
         <a:font script="Viet" typeface="Arial"/>
         <a:font script="Uigh" typeface="Microsoft Uighur"/>
+        <a:font script="Geor" typeface="Sylfaen"/>
+        <a:font script="Armn" typeface="Arial"/>
+        <a:font script="Bugi" typeface="Leelawadee UI"/>
+        <a:font script="Bopo" typeface="Microsoft JhengHei"/>
+        <a:font script="Java" typeface="Javanese Text"/>
+        <a:font script="Lisu" typeface="Segoe UI"/>
+        <a:font script="Mymr" typeface="Myanmar Text"/>
+        <a:font script="Nkoo" typeface="Ebrima"/>
+        <a:font script="Olck" typeface="Nirmala UI"/>
+        <a:font script="Osma" typeface="Ebrima"/>
+        <a:font script="Phag" typeface="Phagspa"/>
+        <a:font script="Syrn" typeface="Estrangelo Edessa"/>
+        <a:font script="Syrj" typeface="Estrangelo Edessa"/>
+        <a:font script="Syre" typeface="Estrangelo Edessa"/>
+        <a:font script="Sora" typeface="Nirmala UI"/>
+        <a:font script="Tale" typeface="Microsoft Tai Le"/>
+        <a:font script="Talu" typeface="Microsoft New Tai Lue"/>
+        <a:font script="Tfng" typeface="Ebrima"/>
       </a:minorFont>
     </a:fontScheme>
     <a:fmtScheme name="Office">
@@ -2912,200 +3173,141 @@
           <a:gsLst>
             <a:gs pos="0">
               <a:schemeClr val="phClr">
-                <a:tint val="50000"/>
-                <a:satMod val="300000"/>
+                <a:lumMod val="110000"/>
+                <a:satMod val="105000"/>
+                <a:tint val="67000"/>
               </a:schemeClr>
             </a:gs>
-            <a:gs pos="35000">
+            <a:gs pos="50000">
               <a:schemeClr val="phClr">
-                <a:tint val="37000"/>
-                <a:satMod val="300000"/>
+                <a:lumMod val="105000"/>
+                <a:satMod val="103000"/>
+                <a:tint val="73000"/>
               </a:schemeClr>
             </a:gs>
             <a:gs pos="100000">
               <a:schemeClr val="phClr">
-                <a:tint val="15000"/>
-                <a:satMod val="350000"/>
+                <a:lumMod val="105000"/>
+                <a:satMod val="109000"/>
+                <a:tint val="81000"/>
               </a:schemeClr>
             </a:gs>
           </a:gsLst>
-          <a:lin ang="16200000" scaled="1"/>
+          <a:lin ang="5400000" scaled="0"/>
         </a:gradFill>
         <a:gradFill rotWithShape="1">
           <a:gsLst>
             <a:gs pos="0">
               <a:schemeClr val="phClr">
-                <a:tint val="100000"/>
+                <a:satMod val="103000"/>
+                <a:lumMod val="102000"/>
+                <a:tint val="94000"/>
+              </a:schemeClr>
+            </a:gs>
+            <a:gs pos="50000">
+              <a:schemeClr val="phClr">
+                <a:satMod val="110000"/>
+                <a:lumMod val="100000"/>
                 <a:shade val="100000"/>
-                <a:satMod val="130000"/>
               </a:schemeClr>
             </a:gs>
             <a:gs pos="100000">
               <a:schemeClr val="phClr">
-                <a:tint val="50000"/>
-                <a:shade val="100000"/>
-                <a:satMod val="350000"/>
+                <a:lumMod val="99000"/>
+                <a:satMod val="120000"/>
+                <a:shade val="78000"/>
               </a:schemeClr>
             </a:gs>
           </a:gsLst>
-          <a:lin ang="16200000" scaled="0"/>
+          <a:lin ang="5400000" scaled="0"/>
         </a:gradFill>
       </a:fillStyleLst>
       <a:lnStyleLst>
-        <a:ln w="9525" cap="flat" cmpd="sng" algn="ctr">
-          <a:solidFill>
-            <a:schemeClr val="phClr">
-              <a:shade val="95000"/>
-              <a:satMod val="105000"/>
-            </a:schemeClr>
-          </a:solidFill>
-          <a:prstDash val="solid"/>
-        </a:ln>
-        <a:ln w="25400" cap="flat" cmpd="sng" algn="ctr">
+        <a:ln w="6350" cap="flat" cmpd="sng" algn="ctr">
           <a:solidFill>
             <a:schemeClr val="phClr"/>
           </a:solidFill>
           <a:prstDash val="solid"/>
+          <a:miter lim="800000"/>
         </a:ln>
-        <a:ln w="38100" cap="flat" cmpd="sng" algn="ctr">
+        <a:ln w="12700" cap="flat" cmpd="sng" algn="ctr">
           <a:solidFill>
             <a:schemeClr val="phClr"/>
           </a:solidFill>
           <a:prstDash val="solid"/>
+          <a:miter lim="800000"/>
+        </a:ln>
+        <a:ln w="19050" cap="flat" cmpd="sng" algn="ctr">
+          <a:solidFill>
+            <a:schemeClr val="phClr"/>
+          </a:solidFill>
+          <a:prstDash val="solid"/>
+          <a:miter lim="800000"/>
         </a:ln>
       </a:lnStyleLst>
       <a:effectStyleLst>
         <a:effectStyle>
+          <a:effectLst/>
+        </a:effectStyle>
+        <a:effectStyle>
+          <a:effectLst/>
+        </a:effectStyle>
+        <a:effectStyle>
           <a:effectLst>
-            <a:outerShdw blurRad="40000" dist="20000" dir="5400000" rotWithShape="0">
+            <a:outerShdw blurRad="57150" dist="19050" dir="5400000" algn="ctr" rotWithShape="0">
               <a:srgbClr val="000000">
-                <a:alpha val="38000"/>
+                <a:alpha val="63000"/>
               </a:srgbClr>
             </a:outerShdw>
           </a:effectLst>
-        </a:effectStyle>
-        <a:effectStyle>
-          <a:effectLst>
-            <a:outerShdw blurRad="40000" dist="23000" dir="5400000" rotWithShape="0">
-              <a:srgbClr val="000000">
-                <a:alpha val="35000"/>
-              </a:srgbClr>
-            </a:outerShdw>
-          </a:effectLst>
-        </a:effectStyle>
-        <a:effectStyle>
-          <a:effectLst>
-            <a:outerShdw blurRad="40000" dist="23000" dir="5400000" rotWithShape="0">
-              <a:srgbClr val="000000">
-                <a:alpha val="35000"/>
-              </a:srgbClr>
-            </a:outerShdw>
-          </a:effectLst>
-          <a:scene3d>
-            <a:camera prst="orthographicFront">
-              <a:rot lat="0" lon="0" rev="0"/>
-            </a:camera>
-            <a:lightRig rig="threePt" dir="t">
-              <a:rot lat="0" lon="0" rev="1200000"/>
-            </a:lightRig>
-          </a:scene3d>
-          <a:sp3d>
-            <a:bevelT w="63500" h="25400"/>
-          </a:sp3d>
         </a:effectStyle>
       </a:effectStyleLst>
       <a:bgFillStyleLst>
         <a:solidFill>
           <a:schemeClr val="phClr"/>
         </a:solidFill>
+        <a:solidFill>
+          <a:schemeClr val="phClr">
+            <a:tint val="95000"/>
+            <a:satMod val="170000"/>
+          </a:schemeClr>
+        </a:solidFill>
         <a:gradFill rotWithShape="1">
           <a:gsLst>
             <a:gs pos="0">
               <a:schemeClr val="phClr">
-                <a:tint val="40000"/>
-                <a:satMod val="350000"/>
+                <a:tint val="93000"/>
+                <a:satMod val="150000"/>
+                <a:shade val="98000"/>
+                <a:lumMod val="102000"/>
               </a:schemeClr>
             </a:gs>
-            <a:gs pos="40000">
+            <a:gs pos="50000">
               <a:schemeClr val="phClr">
-                <a:tint val="45000"/>
-                <a:shade val="99000"/>
-                <a:satMod val="350000"/>
+                <a:tint val="98000"/>
+                <a:satMod val="130000"/>
+                <a:shade val="90000"/>
+                <a:lumMod val="103000"/>
               </a:schemeClr>
             </a:gs>
             <a:gs pos="100000">
               <a:schemeClr val="phClr">
-                <a:shade val="20000"/>
-                <a:satMod val="255000"/>
+                <a:shade val="63000"/>
+                <a:satMod val="120000"/>
               </a:schemeClr>
             </a:gs>
           </a:gsLst>
-          <a:path path="circle">
-            <a:fillToRect l="50000" t="-80000" r="50000" b="180000"/>
-          </a:path>
-        </a:gradFill>
-        <a:gradFill rotWithShape="1">
-          <a:gsLst>
-            <a:gs pos="0">
-              <a:schemeClr val="phClr">
-                <a:tint val="80000"/>
-                <a:satMod val="300000"/>
-              </a:schemeClr>
-            </a:gs>
-            <a:gs pos="100000">
-              <a:schemeClr val="phClr">
-                <a:shade val="30000"/>
-                <a:satMod val="200000"/>
-              </a:schemeClr>
-            </a:gs>
-          </a:gsLst>
-          <a:path path="circle">
-            <a:fillToRect l="50000" t="50000" r="50000" b="50000"/>
-          </a:path>
+          <a:lin ang="5400000" scaled="0"/>
         </a:gradFill>
       </a:bgFillStyleLst>
     </a:fmtScheme>
   </a:themeElements>
-  <a:objectDefaults>
-    <a:spDef>
-      <a:spPr/>
-      <a:bodyPr/>
-      <a:lstStyle/>
-      <a:style>
-        <a:lnRef idx="1">
-          <a:schemeClr val="accent1"/>
-        </a:lnRef>
-        <a:fillRef idx="3">
-          <a:schemeClr val="accent1"/>
-        </a:fillRef>
-        <a:effectRef idx="2">
-          <a:schemeClr val="accent1"/>
-        </a:effectRef>
-        <a:fontRef idx="minor">
-          <a:schemeClr val="lt1"/>
-        </a:fontRef>
-      </a:style>
-    </a:spDef>
-    <a:lnDef>
-      <a:spPr/>
-      <a:bodyPr/>
-      <a:lstStyle/>
-      <a:style>
-        <a:lnRef idx="2">
-          <a:schemeClr val="accent1"/>
-        </a:lnRef>
-        <a:fillRef idx="0">
-          <a:schemeClr val="accent1"/>
-        </a:fillRef>
-        <a:effectRef idx="1">
-          <a:schemeClr val="accent1"/>
-        </a:effectRef>
-        <a:fontRef idx="minor">
-          <a:schemeClr val="tx1"/>
-        </a:fontRef>
-      </a:style>
-    </a:lnDef>
-  </a:objectDefaults>
+  <a:objectDefaults/>
   <a:extraClrSchemeLst/>
+  <a:extLst>
+    <a:ext uri="{05A4C25C-085E-4340-85A3-A5531E510DB2}">
+      <thm15:themeFamily xmlns:thm15="http://schemas.microsoft.com/office/thememl/2012/main" name="Office Theme" id="{2E142A2C-CD16-42D6-873A-C26D2A0506FA}" vid="{1BDDFF52-6CD6-40A5-AB3C-68EB2F1E4D0A}"/>
+    </a:ext>
+  </a:extLst>
 </a:theme>
 </file>
</xml_diff>